<commit_message>
Actualizar Plan de Trabajo oficial A4, caratula de concurso, anexos probatorios de horas y dossier completo consolidado
</commit_message>
<xml_diff>
--- a/proyecto prueba/Proyecto Guido - Primera Persona v3.docx
+++ b/proyecto prueba/Proyecto Guido - Primera Persona v3.docx
@@ -222,11 +222,11 @@
         <w:t>se debe</w:t>
       </w:r>
       <w:r>
-        <w:t xml:space="preserve"> promover la integración humana, la reutilización del conocimiento y la adopción responsable de nuevas tecnologías, consolidando la optimización de los procedimientos organizacionales como la columna vertebral que asegure que el código no solo funcione, sino que sea escalable, seguro </w:t>
+        <w:t xml:space="preserve"> promover la integración humana, la reutilización del conocimiento y la adopción responsable de nuevas tecnologías, consolidando la optimización de los procedimientos organizacionales como la columna vertebral que asegure que el código no solo funcione, sino </w:t>
       </w:r>
       <w:r>
         <w:lastRenderedPageBreak/>
-        <w:t>y responda a las necesidades de las diferentes gestiones, presentes y futuras, alineando las decisiones tecnológicas con los objetivos institucionales y el régimen administrativo.</w:t>
+        <w:t>que sea escalable, seguro y responda a las necesidades de las diferentes gestiones, presentes y futuras, alineando las decisiones tecnológicas con los objetivos institucionales y el régimen administrativo.</w:t>
       </w:r>
     </w:p>
     <w:p>
@@ -339,7 +339,11 @@
     </w:p>
     <w:p>
       <w:r>
-        <w:t>Este contexto requiere fortalecer la organización interna, promover el trabajo colaborativo y establecer procedimientos comunes. El diagnóstico que se presenta a continuación permite identificar las fortalezas sobre las cuales construir una estrategia de mejora, así como las debilidades y oportunidades cuya adecuada gestión contribuirá al fortalecimiento institucional del área.</w:t>
+        <w:t xml:space="preserve">Este contexto requiere fortalecer la organización interna, promover el trabajo colaborativo y establecer procedimientos comunes. El diagnóstico que se presenta a continuación permite identificar las fortalezas sobre las cuales construir una estrategia de mejora, así como las </w:t>
+      </w:r>
+      <w:r>
+        <w:lastRenderedPageBreak/>
+        <w:t>debilidades y oportunidades cuya adecuada gestión contribuirá al fortalecimiento institucional del área.</w:t>
       </w:r>
     </w:p>
     <w:p/>
@@ -552,11 +556,11 @@
         <w:t xml:space="preserve">• Concentración del conocimiento: </w:t>
       </w:r>
       <w:r>
-        <w:t xml:space="preserve">Una parte significativa del conocimiento funcional y técnico de determinados sistemas críticos se encuentra concentrada en un número reducido de agentes, lo que incrementa el riesgo operacional, dificulta la planificación de tareas, genera cuellos de </w:t>
+        <w:t xml:space="preserve">Una parte significativa del conocimiento funcional y técnico de determinados sistemas críticos se encuentra concentrada en un número reducido de agentes, </w:t>
       </w:r>
       <w:r>
         <w:lastRenderedPageBreak/>
-        <w:t>botella y limita la flexibilidad del Departamento para reasignar recursos ante licencias del personal, imprevistos o prioridades institucionales.</w:t>
+        <w:t>lo que incrementa el riesgo operacional, dificulta la planificación de tareas, genera cuellos de botella y limita la flexibilidad del Departamento para reasignar recursos ante licencias del personal, imprevistos o prioridades institucionales.</w:t>
       </w:r>
     </w:p>
     <w:p>
@@ -732,7 +736,11 @@
         <w:t xml:space="preserve">dependencia total del proveedor, </w:t>
       </w:r>
       <w:r>
-        <w:t>pérdida del conocimiento institucional</w:t>
+        <w:t xml:space="preserve">pérdida del </w:t>
+      </w:r>
+      <w:r>
+        <w:lastRenderedPageBreak/>
+        <w:t>conocimiento institucional</w:t>
       </w:r>
       <w:r>
         <w:t xml:space="preserve"> y soberanía</w:t>
@@ -747,7 +755,6 @@
           <w:b/>
           <w:bCs/>
         </w:rPr>
-        <w:lastRenderedPageBreak/>
         <w:t xml:space="preserve">• Requerimientos normativos e imprevistos de gestión: </w:t>
       </w:r>
       <w:r>
@@ -1050,7 +1057,6 @@
     </w:p>
     <w:p>
       <w:r>
-        <w:lastRenderedPageBreak/>
         <w:t xml:space="preserve">El crecimiento sostenido del Departamento exige que los procedimientos organizacionales constituyan la columna vertebral del área, asegurando que el código no solo funcione en la coyuntura, sino que sea técnicamente escalable, seguro frente a vulnerabilidades y sostenible a lo largo del tiempo. </w:t>
       </w:r>
       <w:r>
@@ -1220,6 +1226,7 @@
         <w:ind w:left="708"/>
       </w:pPr>
       <w:r>
+        <w:lastRenderedPageBreak/>
         <w:t>• Centralizar y visibilizar la gestión y el seguimiento de solicitudes, proyectos e incidencias en la plataforma institucional de gestión.</w:t>
       </w:r>
     </w:p>
@@ -1236,7 +1243,6 @@
         <w:ind w:left="708"/>
       </w:pPr>
       <w:r>
-        <w:lastRenderedPageBreak/>
         <w:t>• Establecer estándares técnicos y criterios homogéneos de calidad para el desarrollo, mantenimiento y arquitectura de software.</w:t>
       </w:r>
     </w:p>
@@ -1537,7 +1543,7 @@
           <w:sz w:val="22"/>
           <w:szCs w:val="22"/>
         </w:rPr>
-        <w:t xml:space="preserve">Implementaré un modelo único de organización para centralizar todas las solicitudes en una cartera común administrada en </w:t>
+        <w:t xml:space="preserve"> un modelo único de organización para centralizar todas las solicitudes en una cartera común administrada en </w:t>
       </w:r>
       <w:proofErr w:type="spellStart"/>
       <w:r>
@@ -1557,7 +1563,25 @@
           <w:sz w:val="22"/>
           <w:szCs w:val="22"/>
         </w:rPr>
-        <w:t>. Mi planificación distinguirá el mantenimiento continuo de los nuevos desarrollos, aplicando metodologías ágiles híbridas y adaptadas a la Administración Pública sin imponer esquemas rígidos.</w:t>
+        <w:t xml:space="preserve">. </w:t>
+      </w:r>
+      <w:r>
+        <w:rPr>
+          <w:rFonts w:eastAsia="Times New Roman"/>
+          <w:color w:val="auto"/>
+          <w:sz w:val="22"/>
+          <w:szCs w:val="22"/>
+        </w:rPr>
+        <w:t>La</w:t>
+      </w:r>
+      <w:r>
+        <w:rPr>
+          <w:rFonts w:eastAsia="Times New Roman"/>
+          <w:color w:val="auto"/>
+          <w:sz w:val="22"/>
+          <w:szCs w:val="22"/>
+        </w:rPr>
+        <w:t xml:space="preserve"> planificación distinguirá el mantenimiento continuo de los nuevos desarrollos, aplicando metodologías ágiles híbridas y adaptadas a la Administración Pública sin imponer esquemas rígidos.</w:t>
       </w:r>
     </w:p>
     <w:p>
@@ -1605,132 +1629,6 @@
           <w:szCs w:val="22"/>
         </w:rPr>
         <w:t>La implementación comprenderá:</w:t>
-      </w:r>
-    </w:p>
-    <w:p>
-      <w:pPr>
-        <w:pStyle w:val="Ttulo2"/>
-        <w:rPr>
-          <w:color w:val="auto"/>
-          <w:sz w:val="22"/>
-          <w:szCs w:val="22"/>
-        </w:rPr>
-      </w:pPr>
-      <w:r>
-        <w:rPr>
-          <w:color w:val="auto"/>
-          <w:sz w:val="22"/>
-          <w:szCs w:val="22"/>
-        </w:rPr>
-        <w:t xml:space="preserve">• </w:t>
-      </w:r>
-      <w:proofErr w:type="gramStart"/>
-      <w:r>
-        <w:rPr>
-          <w:color w:val="auto"/>
-          <w:sz w:val="22"/>
-          <w:szCs w:val="22"/>
-        </w:rPr>
-        <w:t>utilización</w:t>
-      </w:r>
-      <w:proofErr w:type="gramEnd"/>
-      <w:r>
-        <w:rPr>
-          <w:color w:val="auto"/>
-          <w:sz w:val="22"/>
-          <w:szCs w:val="22"/>
-        </w:rPr>
-        <w:t xml:space="preserve"> obligatoria de la plataforma </w:t>
-      </w:r>
-      <w:proofErr w:type="spellStart"/>
-      <w:r>
-        <w:rPr>
-          <w:color w:val="auto"/>
-          <w:sz w:val="22"/>
-          <w:szCs w:val="22"/>
-        </w:rPr>
-        <w:t>Redmine</w:t>
-      </w:r>
-      <w:proofErr w:type="spellEnd"/>
-      <w:r>
-        <w:rPr>
-          <w:color w:val="auto"/>
-          <w:sz w:val="22"/>
-          <w:szCs w:val="22"/>
-        </w:rPr>
-        <w:t xml:space="preserve"> para todas las solicitudes; </w:t>
-      </w:r>
-    </w:p>
-    <w:p>
-      <w:pPr>
-        <w:pStyle w:val="Ttulo2"/>
-        <w:rPr>
-          <w:color w:val="auto"/>
-          <w:sz w:val="22"/>
-          <w:szCs w:val="22"/>
-        </w:rPr>
-      </w:pPr>
-      <w:r>
-        <w:rPr>
-          <w:color w:val="auto"/>
-          <w:sz w:val="22"/>
-          <w:szCs w:val="22"/>
-        </w:rPr>
-        <w:t xml:space="preserve">• </w:t>
-      </w:r>
-      <w:proofErr w:type="gramStart"/>
-      <w:r>
-        <w:rPr>
-          <w:color w:val="auto"/>
-          <w:sz w:val="22"/>
-          <w:szCs w:val="22"/>
-        </w:rPr>
-        <w:t>reuniones</w:t>
-      </w:r>
-      <w:proofErr w:type="gramEnd"/>
-      <w:r>
-        <w:rPr>
-          <w:color w:val="auto"/>
-          <w:sz w:val="22"/>
-          <w:szCs w:val="22"/>
-        </w:rPr>
-        <w:t xml:space="preserve"> periódicas de planificación y seguimiento; </w:t>
-      </w:r>
-    </w:p>
-    <w:p>
-      <w:pPr>
-        <w:pStyle w:val="Ttulo2"/>
-        <w:rPr>
-          <w:color w:val="auto"/>
-          <w:sz w:val="22"/>
-          <w:szCs w:val="22"/>
-        </w:rPr>
-      </w:pPr>
-      <w:r>
-        <w:rPr>
-          <w:color w:val="auto"/>
-          <w:sz w:val="22"/>
-          <w:szCs w:val="22"/>
-        </w:rPr>
-        <w:t xml:space="preserve">• </w:t>
-      </w:r>
-      <w:proofErr w:type="gramStart"/>
-      <w:r>
-        <w:rPr>
-          <w:color w:val="auto"/>
-          <w:sz w:val="22"/>
-          <w:szCs w:val="22"/>
-        </w:rPr>
-        <w:t>revisión</w:t>
-      </w:r>
-      <w:proofErr w:type="gramEnd"/>
-      <w:r>
-        <w:rPr>
-          <w:color w:val="auto"/>
-          <w:sz w:val="22"/>
-          <w:szCs w:val="22"/>
-        </w:rPr>
-        <w:t xml:space="preserve"> permanente de prioridades; </w:t>
       </w:r>
     </w:p>
     <w:p>
@@ -1758,6 +1656,132 @@
           <w:sz w:val="22"/>
           <w:szCs w:val="22"/>
         </w:rPr>
+        <w:t>utilización</w:t>
+      </w:r>
+      <w:proofErr w:type="gramEnd"/>
+      <w:r>
+        <w:rPr>
+          <w:color w:val="auto"/>
+          <w:sz w:val="22"/>
+          <w:szCs w:val="22"/>
+        </w:rPr>
+        <w:t xml:space="preserve"> obligatoria de la plataforma </w:t>
+      </w:r>
+      <w:proofErr w:type="spellStart"/>
+      <w:r>
+        <w:rPr>
+          <w:color w:val="auto"/>
+          <w:sz w:val="22"/>
+          <w:szCs w:val="22"/>
+        </w:rPr>
+        <w:t>Redmine</w:t>
+      </w:r>
+      <w:proofErr w:type="spellEnd"/>
+      <w:r>
+        <w:rPr>
+          <w:color w:val="auto"/>
+          <w:sz w:val="22"/>
+          <w:szCs w:val="22"/>
+        </w:rPr>
+        <w:t xml:space="preserve"> para todas las solicitudes; </w:t>
+      </w:r>
+    </w:p>
+    <w:p>
+      <w:pPr>
+        <w:pStyle w:val="Ttulo2"/>
+        <w:rPr>
+          <w:color w:val="auto"/>
+          <w:sz w:val="22"/>
+          <w:szCs w:val="22"/>
+        </w:rPr>
+      </w:pPr>
+      <w:r>
+        <w:rPr>
+          <w:color w:val="auto"/>
+          <w:sz w:val="22"/>
+          <w:szCs w:val="22"/>
+        </w:rPr>
+        <w:t xml:space="preserve">• </w:t>
+      </w:r>
+      <w:proofErr w:type="gramStart"/>
+      <w:r>
+        <w:rPr>
+          <w:color w:val="auto"/>
+          <w:sz w:val="22"/>
+          <w:szCs w:val="22"/>
+        </w:rPr>
+        <w:t>reuniones</w:t>
+      </w:r>
+      <w:proofErr w:type="gramEnd"/>
+      <w:r>
+        <w:rPr>
+          <w:color w:val="auto"/>
+          <w:sz w:val="22"/>
+          <w:szCs w:val="22"/>
+        </w:rPr>
+        <w:t xml:space="preserve"> periódicas de planificación y seguimiento; </w:t>
+      </w:r>
+    </w:p>
+    <w:p>
+      <w:pPr>
+        <w:pStyle w:val="Ttulo2"/>
+        <w:rPr>
+          <w:color w:val="auto"/>
+          <w:sz w:val="22"/>
+          <w:szCs w:val="22"/>
+        </w:rPr>
+      </w:pPr>
+      <w:r>
+        <w:rPr>
+          <w:color w:val="auto"/>
+          <w:sz w:val="22"/>
+          <w:szCs w:val="22"/>
+        </w:rPr>
+        <w:t xml:space="preserve">• </w:t>
+      </w:r>
+      <w:proofErr w:type="gramStart"/>
+      <w:r>
+        <w:rPr>
+          <w:color w:val="auto"/>
+          <w:sz w:val="22"/>
+          <w:szCs w:val="22"/>
+        </w:rPr>
+        <w:t>revisión</w:t>
+      </w:r>
+      <w:proofErr w:type="gramEnd"/>
+      <w:r>
+        <w:rPr>
+          <w:color w:val="auto"/>
+          <w:sz w:val="22"/>
+          <w:szCs w:val="22"/>
+        </w:rPr>
+        <w:t xml:space="preserve"> permanente de prioridades; </w:t>
+      </w:r>
+    </w:p>
+    <w:p>
+      <w:pPr>
+        <w:pStyle w:val="Ttulo2"/>
+        <w:rPr>
+          <w:color w:val="auto"/>
+          <w:sz w:val="22"/>
+          <w:szCs w:val="22"/>
+        </w:rPr>
+      </w:pPr>
+      <w:r>
+        <w:rPr>
+          <w:color w:val="auto"/>
+          <w:sz w:val="22"/>
+          <w:szCs w:val="22"/>
+        </w:rPr>
+        <w:t xml:space="preserve">• </w:t>
+      </w:r>
+      <w:proofErr w:type="gramStart"/>
+      <w:r>
+        <w:rPr>
+          <w:color w:val="auto"/>
+          <w:sz w:val="22"/>
+          <w:szCs w:val="22"/>
+        </w:rPr>
         <w:t>redistribución</w:t>
       </w:r>
       <w:proofErr w:type="gramEnd"/>
@@ -1992,7 +2016,7 @@
         <w:rPr>
           <w:rFonts w:eastAsia="Times New Roman"/>
         </w:rPr>
-        <w:t xml:space="preserve">Implementaré un programa de gestión del conocimiento asignando gradualmente Referentes Secundarios en los sistemas críticos, promoviendo la transferencia técnica cruzada y estableciendo documentación mínima obligatoria.</w:t>
+        <w:t xml:space="preserve"> un programa de gestión del conocimiento asignando gradualmente Referentes Secundarios en los sistemas críticos, promoviendo la transferencia técnica cruzada y estableciendo documentación mínima obligatoria.</w:t>
       </w:r>
     </w:p>
     <w:p>
@@ -2300,6 +2324,7 @@
           <w:sz w:val="26"/>
           <w:szCs w:val="26"/>
         </w:rPr>
+        <w:lastRenderedPageBreak/>
         <w:t>5.3 Estandarización técnica y calidad del software</w:t>
       </w:r>
     </w:p>
@@ -2336,7 +2361,6 @@
           <w:sz w:val="22"/>
           <w:szCs w:val="22"/>
         </w:rPr>
-        <w:lastRenderedPageBreak/>
         <w:t>La coexistencia de aplicaciones desarrolladas bajo distintos criterios técnicos dificulta el mantenimiento, incrementa la deuda técnica y genera diferencias significativas en la calidad de los desarrollos.</w:t>
       </w:r>
     </w:p>
@@ -2387,7 +2411,7 @@
           <w:sz w:val="22"/>
           <w:szCs w:val="22"/>
         </w:rPr>
-        <w:t>é</w:t>
+        <w:t>á</w:t>
       </w:r>
       <w:r>
         <w:rPr>
@@ -2646,7 +2670,31 @@
           <w:sz w:val="22"/>
           <w:szCs w:val="22"/>
         </w:rPr>
-        <w:t xml:space="preserve">Institucionalizaré un procedimiento único para el relevamiento, análisis y priorización de requerimientos, actuando como nexo entre las áreas usuarias y el equipo técnico</w:t>
+        <w:t xml:space="preserve">Se </w:t>
+      </w:r>
+      <w:r>
+        <w:rPr>
+          <w:rFonts w:ascii="Arial" w:hAnsi="Arial" w:cs="Arial"/>
+          <w:sz w:val="22"/>
+          <w:szCs w:val="22"/>
+        </w:rPr>
+        <w:t>Institucionalizar</w:t>
+      </w:r>
+      <w:r>
+        <w:rPr>
+          <w:rFonts w:ascii="Arial" w:hAnsi="Arial" w:cs="Arial"/>
+          <w:sz w:val="22"/>
+          <w:szCs w:val="22"/>
+        </w:rPr>
+        <w:t>á</w:t>
+      </w:r>
+      <w:r>
+        <w:rPr>
+          <w:rFonts w:ascii="Arial" w:hAnsi="Arial" w:cs="Arial"/>
+          <w:sz w:val="22"/>
+          <w:szCs w:val="22"/>
+        </w:rPr>
+        <w:t xml:space="preserve"> un procedimiento único para el relevamiento, análisis y priorización de requerimientos, actuando como nexo entre las áreas usuarias y el equipo técnico</w:t>
       </w:r>
       <w:r>
         <w:rPr>
@@ -2753,6 +2801,7 @@
         <w:jc w:val="left"/>
       </w:pPr>
       <w:r>
+        <w:lastRenderedPageBreak/>
         <w:t xml:space="preserve">recursos necesarios; </w:t>
       </w:r>
     </w:p>
@@ -2810,7 +2859,6 @@
           <w:sz w:val="24"/>
           <w:szCs w:val="24"/>
         </w:rPr>
-        <w:lastRenderedPageBreak/>
         <w:t>Resultado esperado</w:t>
       </w:r>
     </w:p>
@@ -2935,7 +2983,79 @@
           <w:sz w:val="22"/>
           <w:szCs w:val="22"/>
         </w:rPr>
-        <w:t>Ejerceré un rol de conducción técnica durante todo el ciclo de contratación, asegurando que las soluciones externas se integren adecuadamente al ecosistema tecnológico municipal. Para ello, asignaré al seguimiento de cada proyecto a uno o más agentes del Departamento con experiencia en la temática funcional involucrada, quienes participarán en las etapas de relevamiento, validación y seguimiento técnico, complementando el conocimiento tecnológico del proveedor con el conocimiento de los procesos administrativos municipales.</w:t>
+        <w:t>El Departamento</w:t>
+      </w:r>
+      <w:r>
+        <w:rPr>
+          <w:rFonts w:eastAsia="Times New Roman"/>
+          <w:color w:val="auto"/>
+          <w:sz w:val="22"/>
+          <w:szCs w:val="22"/>
+        </w:rPr>
+        <w:t xml:space="preserve"> e</w:t>
+      </w:r>
+      <w:r>
+        <w:rPr>
+          <w:rFonts w:eastAsia="Times New Roman"/>
+          <w:color w:val="auto"/>
+          <w:sz w:val="22"/>
+          <w:szCs w:val="22"/>
+        </w:rPr>
+        <w:t>jercer</w:t>
+      </w:r>
+      <w:r>
+        <w:rPr>
+          <w:rFonts w:eastAsia="Times New Roman"/>
+          <w:color w:val="auto"/>
+          <w:sz w:val="22"/>
+          <w:szCs w:val="22"/>
+        </w:rPr>
+        <w:t>á</w:t>
+      </w:r>
+      <w:r>
+        <w:rPr>
+          <w:rFonts w:eastAsia="Times New Roman"/>
+          <w:color w:val="auto"/>
+          <w:sz w:val="22"/>
+          <w:szCs w:val="22"/>
+        </w:rPr>
+        <w:t xml:space="preserve"> un rol de conducción técnica durante todo el ciclo de contratación, asegurando que las soluciones externas se integren adecuadamente al ecosistema tecnológico municipal. Para ello, </w:t>
+      </w:r>
+      <w:r>
+        <w:rPr>
+          <w:rFonts w:eastAsia="Times New Roman"/>
+          <w:color w:val="auto"/>
+          <w:sz w:val="22"/>
+          <w:szCs w:val="22"/>
+        </w:rPr>
+        <w:t xml:space="preserve">se </w:t>
+      </w:r>
+      <w:r>
+        <w:rPr>
+          <w:rFonts w:eastAsia="Times New Roman"/>
+          <w:color w:val="auto"/>
+          <w:sz w:val="22"/>
+          <w:szCs w:val="22"/>
+        </w:rPr>
+        <w:t>asignar</w:t>
+      </w:r>
+      <w:r>
+        <w:rPr>
+          <w:rFonts w:eastAsia="Times New Roman"/>
+          <w:color w:val="auto"/>
+          <w:sz w:val="22"/>
+          <w:szCs w:val="22"/>
+        </w:rPr>
+        <w:t>á</w:t>
+      </w:r>
+      <w:r>
+        <w:rPr>
+          <w:rFonts w:eastAsia="Times New Roman"/>
+          <w:color w:val="auto"/>
+          <w:sz w:val="22"/>
+          <w:szCs w:val="22"/>
+        </w:rPr>
+        <w:t xml:space="preserve"> al seguimiento de cada proyecto a uno o más agentes del Departamento con experiencia en la temática funcional involucrada, quienes participarán en las etapas de relevamiento, validación y seguimiento técnico, complementando el conocimiento tecnológico del proveedor con el conocimiento de los procesos administrativos municipales.</w:t>
       </w:r>
     </w:p>
     <w:p>
@@ -3148,7 +3268,17 @@
           <w:sz w:val="22"/>
           <w:szCs w:val="22"/>
         </w:rPr>
-        <w:t>La incorporación de nuevas herramientas y tecnologías suele realizarse sin criterios institucionales comunes, quedando muchas veces librada a decisiones individuales. Asimismo, la coexistencia de tecnologías obsoletas y plataformas con soporte vigente dificulta la estandarización del desarrollo y la evolución tecnológica del Departamento.</w:t>
+        <w:t xml:space="preserve">La incorporación de nuevas herramientas y tecnologías suele realizarse sin criterios institucionales comunes, quedando muchas veces librada a decisiones individuales. Asimismo, </w:t>
+      </w:r>
+      <w:r>
+        <w:rPr>
+          <w:rFonts w:eastAsia="Times New Roman"/>
+          <w:color w:val="auto"/>
+          <w:sz w:val="22"/>
+          <w:szCs w:val="22"/>
+        </w:rPr>
+        <w:lastRenderedPageBreak/>
+        <w:t>la coexistencia de tecnologías obsoletas y plataformas con soporte vigente dificulta la estandarización del desarrollo y la evolución tecnológica del Departamento.</w:t>
       </w:r>
     </w:p>
     <w:p>
@@ -3197,8 +3327,34 @@
           <w:sz w:val="22"/>
           <w:szCs w:val="22"/>
         </w:rPr>
-        <w:lastRenderedPageBreak/>
-        <w:t xml:space="preserve">Gestionaré la innovación con criterio institucional, promoviendo tecnologías vigentes con soporte activo. Adoptaré la Inteligencia Artificial como herramienta de asistencia en los entornos de desarrollo (IDE) para agilizar codificación, detección de errores y documentación, bajo pautas de uso seguro que resguarden la información municipal. La transición será gradual y acompañada por </w:t>
+        <w:t>Se g</w:t>
+      </w:r>
+      <w:r>
+        <w:rPr>
+          <w:rFonts w:eastAsia="Times New Roman"/>
+          <w:color w:val="auto"/>
+          <w:sz w:val="22"/>
+          <w:szCs w:val="22"/>
+        </w:rPr>
+        <w:t>estionar</w:t>
+      </w:r>
+      <w:r>
+        <w:rPr>
+          <w:rFonts w:eastAsia="Times New Roman"/>
+          <w:color w:val="auto"/>
+          <w:sz w:val="22"/>
+          <w:szCs w:val="22"/>
+        </w:rPr>
+        <w:t>á</w:t>
+      </w:r>
+      <w:r>
+        <w:rPr>
+          <w:rFonts w:eastAsia="Times New Roman"/>
+          <w:color w:val="auto"/>
+          <w:sz w:val="22"/>
+          <w:szCs w:val="22"/>
+        </w:rPr>
+        <w:t xml:space="preserve"> la innovación con criterio institucional, promoviendo tecnologías vigentes con soporte activo. Adoptaré la Inteligencia Artificial como herramienta de asistencia en los entornos de desarrollo (IDE) para agilizar codificación, detección de errores y documentación, bajo pautas de uso seguro que resguarden la información municipal. La transición será gradual y acompañada por </w:t>
       </w:r>
       <w:proofErr w:type="spellStart"/>
       <w:r>
@@ -3602,7 +3758,7 @@
           <w:sz w:val="22"/>
           <w:szCs w:val="22"/>
         </w:rPr>
-        <w:t>é</w:t>
+        <w:t>á</w:t>
       </w:r>
       <w:r>
         <w:rPr>
@@ -3689,6 +3845,7 @@
         <w:rPr>
           <w:rFonts w:eastAsia="Times New Roman"/>
         </w:rPr>
+        <w:lastRenderedPageBreak/>
         <w:t xml:space="preserve">uso de </w:t>
       </w:r>
       <w:proofErr w:type="spellStart"/>
@@ -3741,7 +3898,6 @@
         <w:rPr>
           <w:rFonts w:eastAsia="Times New Roman"/>
         </w:rPr>
-        <w:lastRenderedPageBreak/>
         <w:t>participación cruzada planificada en proyectos para favorecer el conocimiento mutuo entre equipos.</w:t>
       </w:r>
     </w:p>
@@ -4165,6 +4321,7 @@
           <w:sz w:val="22"/>
           <w:szCs w:val="22"/>
         </w:rPr>
+        <w:lastRenderedPageBreak/>
         <w:t>Las acciones desarrolladas en el capítulo anterior pueden implementarse utilizando los recursos actualmente disponibles y constituyen una estrategia realista para mejorar el funcionamiento del Departamento.</w:t>
       </w:r>
     </w:p>
@@ -4183,7 +4340,6 @@
           <w:sz w:val="22"/>
           <w:szCs w:val="22"/>
         </w:rPr>
-        <w:lastRenderedPageBreak/>
         <w:t>No obstante, la incorporación gradual de recursos presupuestarios permitiría consolidar y potenciar dichas acciones, incrementando la productividad del equipo, fortaleciendo la calidad del software y acelerando el proceso de modernización tecnológica.</w:t>
       </w:r>
     </w:p>
@@ -4325,6 +4481,7 @@
           <w:b/>
           <w:sz w:val="24"/>
           <w:szCs w:val="24"/>
+          <w:u w:val="single"/>
         </w:rPr>
       </w:pPr>
       <w:r>
@@ -4546,6 +4703,7 @@
           <w:sz w:val="22"/>
           <w:szCs w:val="22"/>
         </w:rPr>
+        <w:lastRenderedPageBreak/>
         <w:t>La rápida evolución de lenguajes, metodologías y arquitecturas requiere instancias de formación especializada para actualizar constantemente al equipo más allá del aprendizaje autónomo.</w:t>
       </w:r>
     </w:p>
@@ -4559,7 +4717,6 @@
         </w:rPr>
       </w:pPr>
       <w:r>
-        <w:lastRenderedPageBreak/>
         <w:br/>
       </w:r>
       <w:r>
@@ -5040,6 +5197,7 @@
         <w:rPr>
           <w:rFonts w:eastAsia="Times New Roman"/>
         </w:rPr>
+        <w:lastRenderedPageBreak/>
         <w:t xml:space="preserve">• </w:t>
       </w:r>
       <w:proofErr w:type="gramStart"/>
@@ -5204,7 +5362,16 @@
           <w:sz w:val="22"/>
           <w:szCs w:val="22"/>
         </w:rPr>
-        <w:t>Incorporar plataformas corporativas orientadas al trabajo colaborativo y a la gestión compartida del conocimiento, que permitan centralizar la documentación técnica de los sistemas, facilitar la revisión cruzada de código y mejorar la articulación entre los grupos de desarrollo.</w:t>
+        <w:t>Unificar ambos equipos de trabajo en un mismo espacio físico e i</w:t>
+      </w:r>
+      <w:r>
+        <w:rPr>
+          <w:rFonts w:eastAsia="Times New Roman"/>
+          <w:color w:val="auto"/>
+          <w:sz w:val="22"/>
+          <w:szCs w:val="22"/>
+        </w:rPr>
+        <w:t>ncorporar plataformas corporativas orientadas al trabajo colaborativo y a la gestión compartida del conocimiento, que permitan centralizar la documentación técnica de los sistemas, facilitar la revisión cruzada de código y mejorar la articulación entre los grupos de desarrollo.</w:t>
       </w:r>
     </w:p>
     <w:p>
@@ -5293,6 +5460,40 @@
         <w:rPr>
           <w:rFonts w:eastAsia="Times New Roman"/>
         </w:rPr>
+        <w:t>unificación</w:t>
+      </w:r>
+      <w:proofErr w:type="gramEnd"/>
+      <w:r>
+        <w:rPr>
+          <w:rFonts w:eastAsia="Times New Roman"/>
+        </w:rPr>
+        <w:t xml:space="preserve"> del equipo en un mismo espacio físico para facilitar la comunicación interna</w:t>
+      </w:r>
+      <w:r>
+        <w:rPr>
+          <w:rFonts w:eastAsia="Times New Roman"/>
+        </w:rPr>
+        <w:t>;</w:t>
+      </w:r>
+    </w:p>
+    <w:p>
+      <w:pPr>
+        <w:ind w:left="708"/>
+        <w:rPr>
+          <w:rFonts w:eastAsia="Times New Roman"/>
+        </w:rPr>
+      </w:pPr>
+      <w:r>
+        <w:rPr>
+          <w:rFonts w:eastAsia="Times New Roman"/>
+        </w:rPr>
+        <w:t xml:space="preserve">• </w:t>
+      </w:r>
+      <w:proofErr w:type="gramStart"/>
+      <w:r>
+        <w:rPr>
+          <w:rFonts w:eastAsia="Times New Roman"/>
+        </w:rPr>
         <w:t>implementación</w:t>
       </w:r>
       <w:proofErr w:type="gramEnd"/>
@@ -5495,6 +5696,7 @@
           <w:sz w:val="22"/>
           <w:szCs w:val="22"/>
         </w:rPr>
+        <w:lastRenderedPageBreak/>
         <w:t>Incorporar herramientas de analítica y visualización que complementen la plataforma de gestión de proyectos del Departamento, permitiendo generar tableros ejecutivos automáticos, medir indicadores de capacidad operativa y facilitar la toma de decisiones informada.</w:t>
       </w:r>
     </w:p>
@@ -5518,454 +5720,508 @@
           <w:sz w:val="24"/>
           <w:szCs w:val="24"/>
         </w:rPr>
+        <w:t>Implementación</w:t>
+      </w:r>
+    </w:p>
+    <w:p>
+      <w:pPr>
+        <w:rPr>
+          <w:rFonts w:eastAsia="Times New Roman"/>
+        </w:rPr>
+      </w:pPr>
+      <w:r>
+        <w:rPr>
+          <w:rFonts w:eastAsia="Times New Roman"/>
+        </w:rPr>
+        <w:t>La implementación comprenderá:</w:t>
+      </w:r>
+    </w:p>
+    <w:p>
+      <w:pPr>
+        <w:ind w:left="708"/>
+        <w:rPr>
+          <w:rFonts w:eastAsia="Times New Roman"/>
+        </w:rPr>
+      </w:pPr>
+      <w:r>
+        <w:rPr>
+          <w:rFonts w:eastAsia="Times New Roman"/>
+        </w:rPr>
+        <w:t xml:space="preserve">• </w:t>
+      </w:r>
+      <w:proofErr w:type="gramStart"/>
+      <w:r>
+        <w:rPr>
+          <w:rFonts w:eastAsia="Times New Roman"/>
+        </w:rPr>
+        <w:t>integración</w:t>
+      </w:r>
+      <w:proofErr w:type="gramEnd"/>
+      <w:r>
+        <w:rPr>
+          <w:rFonts w:eastAsia="Times New Roman"/>
+        </w:rPr>
+        <w:t xml:space="preserve"> de módulos de analítica y tableros de control sobre la cartera de proyectos del Departamento;</w:t>
+      </w:r>
+    </w:p>
+    <w:p>
+      <w:pPr>
+        <w:ind w:left="708"/>
+        <w:rPr>
+          <w:rFonts w:eastAsia="Times New Roman"/>
+        </w:rPr>
+      </w:pPr>
+      <w:r>
+        <w:rPr>
+          <w:rFonts w:eastAsia="Times New Roman"/>
+        </w:rPr>
+        <w:t xml:space="preserve">• </w:t>
+      </w:r>
+      <w:proofErr w:type="gramStart"/>
+      <w:r>
+        <w:rPr>
+          <w:rFonts w:eastAsia="Times New Roman"/>
+        </w:rPr>
+        <w:t>definición</w:t>
+      </w:r>
+      <w:proofErr w:type="gramEnd"/>
+      <w:r>
+        <w:rPr>
+          <w:rFonts w:eastAsia="Times New Roman"/>
+        </w:rPr>
+        <w:t xml:space="preserve"> de paneles visuales para el seguimiento del estado de solicitudes, tiempos de respuesta y volumen de trabajo;</w:t>
+      </w:r>
+    </w:p>
+    <w:p>
+      <w:pPr>
+        <w:ind w:left="708"/>
+        <w:rPr>
+          <w:rFonts w:eastAsia="Times New Roman"/>
+        </w:rPr>
+      </w:pPr>
+      <w:r>
+        <w:rPr>
+          <w:rFonts w:eastAsia="Times New Roman"/>
+        </w:rPr>
+        <w:t xml:space="preserve">• </w:t>
+      </w:r>
+      <w:proofErr w:type="gramStart"/>
+      <w:r>
+        <w:rPr>
+          <w:rFonts w:eastAsia="Times New Roman"/>
+        </w:rPr>
+        <w:t>utilización</w:t>
+      </w:r>
+      <w:proofErr w:type="gramEnd"/>
+      <w:r>
+        <w:rPr>
+          <w:rFonts w:eastAsia="Times New Roman"/>
+        </w:rPr>
+        <w:t xml:space="preserve"> de métricas objetivas para informar la evolución de las iniciativas a las autoridades municipales.</w:t>
+      </w:r>
+    </w:p>
+    <w:p>
+      <w:pPr>
+        <w:ind w:left="708"/>
+        <w:rPr>
+          <w:rFonts w:eastAsia="Times New Roman"/>
+          <w:b/>
+          <w:sz w:val="24"/>
+          <w:szCs w:val="24"/>
+        </w:rPr>
+      </w:pPr>
+    </w:p>
+    <w:p>
+      <w:pPr>
+        <w:pStyle w:val="Ttulo2"/>
+        <w:rPr>
+          <w:b/>
+          <w:sz w:val="24"/>
+          <w:szCs w:val="24"/>
+        </w:rPr>
+      </w:pPr>
+      <w:r>
+        <w:rPr>
+          <w:b/>
+          <w:sz w:val="24"/>
+          <w:szCs w:val="24"/>
+        </w:rPr>
+        <w:t>Resultado esperado</w:t>
+      </w:r>
+    </w:p>
+    <w:p>
+      <w:pPr>
+        <w:pStyle w:val="Ttulo2"/>
+        <w:rPr>
+          <w:rFonts w:eastAsia="Times New Roman"/>
+          <w:color w:val="auto"/>
+          <w:sz w:val="22"/>
+          <w:szCs w:val="22"/>
+        </w:rPr>
+      </w:pPr>
+      <w:r>
+        <w:rPr>
+          <w:rFonts w:eastAsia="Times New Roman"/>
+          <w:color w:val="auto"/>
+          <w:sz w:val="22"/>
+          <w:szCs w:val="22"/>
+        </w:rPr>
+        <w:t>Se obtendrá visibilidad gerencial completa sobre la capacidad operativa del Departamento, optimizando la asignación de recursos y sustentando la toma de decisiones en evidencia objetiva.</w:t>
+      </w:r>
+    </w:p>
+    <w:p>
+      <w:pPr>
+        <w:pStyle w:val="Ttulo2"/>
+      </w:pPr>
+    </w:p>
+    <w:p>
+      <w:pPr>
+        <w:pStyle w:val="Ttulo2"/>
+        <w:rPr>
+          <w:b/>
+        </w:rPr>
+      </w:pPr>
+      <w:r>
+        <w:rPr>
+          <w:b/>
+        </w:rPr>
+        <w:t>6.6 Fortalecimiento gradual de la estructura técnica y especialización funcional</w:t>
+      </w:r>
+    </w:p>
+    <w:p>
+      <w:pPr>
+        <w:pStyle w:val="Ttulo2"/>
+        <w:rPr>
+          <w:b/>
+          <w:sz w:val="24"/>
+          <w:szCs w:val="24"/>
+        </w:rPr>
+      </w:pPr>
+      <w:r>
+        <w:rPr>
+          <w:b/>
+          <w:sz w:val="24"/>
+          <w:szCs w:val="24"/>
+        </w:rPr>
+        <w:t>Problema</w:t>
+      </w:r>
+    </w:p>
+    <w:p>
+      <w:pPr>
+        <w:pStyle w:val="Ttulo2"/>
+        <w:rPr>
+          <w:rFonts w:eastAsia="Times New Roman"/>
+          <w:color w:val="auto"/>
+          <w:sz w:val="22"/>
+          <w:szCs w:val="22"/>
+        </w:rPr>
+      </w:pPr>
+      <w:r>
+        <w:rPr>
+          <w:rFonts w:eastAsia="Times New Roman"/>
+          <w:color w:val="auto"/>
+          <w:sz w:val="22"/>
+          <w:szCs w:val="22"/>
+        </w:rPr>
+        <w:t>La dotación actual limita la posibilidad de asignar responsabilidades especializadas en análisis funcional, arquitectura de software, calidad y liderazgo técnico, obligando a los agentes a desempeñar simultáneamente múltiples funciones.</w:t>
+      </w:r>
+    </w:p>
+    <w:p>
+      <w:pPr>
+        <w:pStyle w:val="Ttulo2"/>
+        <w:rPr>
+          <w:b/>
+          <w:sz w:val="24"/>
+          <w:szCs w:val="24"/>
+        </w:rPr>
+      </w:pPr>
+      <w:r>
+        <w:rPr>
+          <w:b/>
+        </w:rPr>
+        <w:br/>
+      </w:r>
+      <w:r>
+        <w:rPr>
+          <w:b/>
+          <w:sz w:val="24"/>
+          <w:szCs w:val="24"/>
+        </w:rPr>
+        <w:t>Propuesta</w:t>
+      </w:r>
+    </w:p>
+    <w:p>
+      <w:pPr>
+        <w:pStyle w:val="Ttulo2"/>
+        <w:rPr>
+          <w:rFonts w:eastAsia="Times New Roman"/>
+          <w:color w:val="auto"/>
+          <w:sz w:val="22"/>
+          <w:szCs w:val="22"/>
+        </w:rPr>
+      </w:pPr>
+      <w:r>
+        <w:rPr>
+          <w:rFonts w:eastAsia="Times New Roman"/>
+          <w:color w:val="auto"/>
+          <w:sz w:val="22"/>
+          <w:szCs w:val="22"/>
+        </w:rPr>
+        <w:t>En función de la</w:t>
+      </w:r>
+      <w:r>
+        <w:rPr>
+          <w:rFonts w:eastAsia="Times New Roman"/>
+          <w:color w:val="auto"/>
+          <w:sz w:val="22"/>
+          <w:szCs w:val="22"/>
+        </w:rPr>
+        <w:t xml:space="preserve"> disponibilidad presupuestaria se</w:t>
+      </w:r>
+      <w:r>
+        <w:rPr>
+          <w:rFonts w:eastAsia="Times New Roman"/>
+          <w:color w:val="auto"/>
+          <w:sz w:val="22"/>
+          <w:szCs w:val="22"/>
+        </w:rPr>
+        <w:t xml:space="preserve"> incorporar</w:t>
+      </w:r>
+      <w:r>
+        <w:rPr>
+          <w:rFonts w:eastAsia="Times New Roman"/>
+          <w:color w:val="auto"/>
+          <w:sz w:val="22"/>
+          <w:szCs w:val="22"/>
+        </w:rPr>
+        <w:t>án</w:t>
+      </w:r>
+      <w:r>
+        <w:rPr>
+          <w:rFonts w:eastAsia="Times New Roman"/>
+          <w:color w:val="auto"/>
+          <w:sz w:val="22"/>
+          <w:szCs w:val="22"/>
+        </w:rPr>
+        <w:t xml:space="preserve"> recursos humanos, </w:t>
+      </w:r>
+      <w:r>
+        <w:rPr>
+          <w:rFonts w:eastAsia="Times New Roman"/>
+          <w:color w:val="auto"/>
+          <w:sz w:val="22"/>
+          <w:szCs w:val="22"/>
+        </w:rPr>
+        <w:t xml:space="preserve">para </w:t>
+      </w:r>
+      <w:r>
+        <w:rPr>
+          <w:rFonts w:eastAsia="Times New Roman"/>
+          <w:color w:val="auto"/>
+          <w:sz w:val="22"/>
+          <w:szCs w:val="22"/>
+        </w:rPr>
+        <w:t>fortalecer progresivamente la estructura técnica del Departamento mediante la incorporación de perfiles profesionales que permitan consolidar una mayor especialización funcional y una mejor distribución de responsabilidades.</w:t>
+      </w:r>
+    </w:p>
+    <w:p>
+      <w:pPr>
+        <w:pStyle w:val="Ttulo2"/>
+      </w:pPr>
+    </w:p>
+    <w:p>
+      <w:pPr>
+        <w:pStyle w:val="Ttulo2"/>
+        <w:rPr>
+          <w:b/>
+          <w:sz w:val="24"/>
+          <w:szCs w:val="24"/>
+        </w:rPr>
+      </w:pPr>
+      <w:r>
+        <w:rPr>
+          <w:b/>
+          <w:sz w:val="24"/>
+          <w:szCs w:val="24"/>
+        </w:rPr>
+        <w:t>Implementación</w:t>
+      </w:r>
+    </w:p>
+    <w:p>
+      <w:pPr>
+        <w:rPr>
+          <w:rFonts w:eastAsia="Times New Roman"/>
+        </w:rPr>
+      </w:pPr>
+      <w:r>
+        <w:rPr>
+          <w:rFonts w:eastAsia="Times New Roman"/>
+        </w:rPr>
+        <w:t>La implementación comprenderá:</w:t>
+      </w:r>
+    </w:p>
+    <w:p>
+      <w:pPr>
+        <w:ind w:left="708"/>
+        <w:rPr>
+          <w:rFonts w:eastAsia="Times New Roman"/>
+        </w:rPr>
+      </w:pPr>
+      <w:r>
+        <w:rPr>
+          <w:rFonts w:eastAsia="Times New Roman"/>
+        </w:rPr>
+        <w:t xml:space="preserve">• </w:t>
+      </w:r>
+      <w:proofErr w:type="gramStart"/>
+      <w:r>
+        <w:rPr>
+          <w:rFonts w:eastAsia="Times New Roman"/>
+        </w:rPr>
+        <w:t>incorporación</w:t>
+      </w:r>
+      <w:proofErr w:type="gramEnd"/>
+      <w:r>
+        <w:rPr>
+          <w:rFonts w:eastAsia="Times New Roman"/>
+        </w:rPr>
+        <w:t xml:space="preserve"> gradual de perfiles técnicos dedicados al desarrollo de software;</w:t>
+      </w:r>
+    </w:p>
+    <w:p>
+      <w:pPr>
+        <w:ind w:left="708"/>
+        <w:rPr>
+          <w:rFonts w:eastAsia="Times New Roman"/>
+        </w:rPr>
+      </w:pPr>
+      <w:r>
+        <w:rPr>
+          <w:rFonts w:eastAsia="Times New Roman"/>
+        </w:rPr>
+        <w:t xml:space="preserve">• </w:t>
+      </w:r>
+      <w:proofErr w:type="gramStart"/>
+      <w:r>
+        <w:rPr>
+          <w:rFonts w:eastAsia="Times New Roman"/>
+        </w:rPr>
+        <w:t>fortalecimiento</w:t>
+      </w:r>
+      <w:proofErr w:type="gramEnd"/>
+      <w:r>
+        <w:rPr>
+          <w:rFonts w:eastAsia="Times New Roman"/>
+        </w:rPr>
+        <w:t xml:space="preserve"> de las funciones de análisis funcional, arquitectura y aseguramiento de calidad asignadas a los perfiles de mayor experiencia;</w:t>
+      </w:r>
+    </w:p>
+    <w:p>
+      <w:pPr>
+        <w:ind w:left="708"/>
+        <w:rPr>
+          <w:rFonts w:eastAsia="Times New Roman"/>
+        </w:rPr>
+      </w:pPr>
+      <w:r>
+        <w:rPr>
+          <w:rFonts w:eastAsia="Times New Roman"/>
+        </w:rPr>
+        <w:t xml:space="preserve">• </w:t>
+      </w:r>
+      <w:proofErr w:type="gramStart"/>
+      <w:r>
+        <w:rPr>
+          <w:rFonts w:eastAsia="Times New Roman"/>
+        </w:rPr>
+        <w:t>conformación</w:t>
+      </w:r>
+      <w:proofErr w:type="gramEnd"/>
+      <w:r>
+        <w:rPr>
+          <w:rFonts w:eastAsia="Times New Roman"/>
+        </w:rPr>
+        <w:t xml:space="preserve"> de equipos con responsabilidades claramente definidas y esquemas de </w:t>
+      </w:r>
+      <w:proofErr w:type="spellStart"/>
+      <w:r>
+        <w:rPr>
+          <w:rFonts w:eastAsia="Times New Roman"/>
+        </w:rPr>
+        <w:t>mentoría</w:t>
+      </w:r>
+      <w:proofErr w:type="spellEnd"/>
+      <w:r>
+        <w:rPr>
+          <w:rFonts w:eastAsia="Times New Roman"/>
+        </w:rPr>
+        <w:t xml:space="preserve"> hacia el personal de reciente ingreso;</w:t>
+      </w:r>
+    </w:p>
+    <w:p>
+      <w:pPr>
+        <w:ind w:left="708"/>
+        <w:rPr>
+          <w:rFonts w:eastAsia="Times New Roman"/>
+        </w:rPr>
+      </w:pPr>
+      <w:r>
+        <w:rPr>
+          <w:rFonts w:eastAsia="Times New Roman"/>
+        </w:rPr>
+        <w:t xml:space="preserve">• </w:t>
+      </w:r>
+      <w:proofErr w:type="gramStart"/>
+      <w:r>
+        <w:rPr>
+          <w:rFonts w:eastAsia="Times New Roman"/>
+        </w:rPr>
+        <w:t>evaluación</w:t>
+      </w:r>
+      <w:proofErr w:type="gramEnd"/>
+      <w:r>
+        <w:rPr>
+          <w:rFonts w:eastAsia="Times New Roman"/>
+        </w:rPr>
+        <w:t xml:space="preserve"> periódica de la capacidad operativa y cohesión de los grupos de trabajo.</w:t>
+      </w:r>
+    </w:p>
+    <w:p>
+      <w:pPr>
+        <w:rPr>
+          <w:rFonts w:eastAsia="Times New Roman"/>
+        </w:rPr>
+      </w:pPr>
+    </w:p>
+    <w:p>
+      <w:pPr>
+        <w:pStyle w:val="Ttulo2"/>
+        <w:rPr>
+          <w:b/>
+          <w:sz w:val="24"/>
+          <w:szCs w:val="24"/>
+        </w:rPr>
+      </w:pPr>
+      <w:r>
+        <w:rPr>
+          <w:b/>
+          <w:sz w:val="24"/>
+          <w:szCs w:val="24"/>
+        </w:rPr>
+        <w:t>Resultado esperado</w:t>
+      </w:r>
+    </w:p>
+    <w:p>
+      <w:pPr>
+        <w:rPr>
+          <w:rFonts w:eastAsia="Times New Roman"/>
+        </w:rPr>
+      </w:pPr>
+      <w:r>
+        <w:rPr>
+          <w:rFonts w:eastAsia="Times New Roman"/>
+        </w:rPr>
         <w:lastRenderedPageBreak/>
-        <w:t>Implementación</w:t>
-      </w:r>
-    </w:p>
-    <w:p>
-      <w:pPr>
-        <w:rPr>
-          <w:rFonts w:eastAsia="Times New Roman"/>
-        </w:rPr>
-      </w:pPr>
-      <w:r>
-        <w:rPr>
-          <w:rFonts w:eastAsia="Times New Roman"/>
-        </w:rPr>
-        <w:t>La implementación comprenderá:</w:t>
-      </w:r>
-    </w:p>
-    <w:p>
-      <w:pPr>
-        <w:ind w:left="708"/>
-        <w:rPr>
-          <w:rFonts w:eastAsia="Times New Roman"/>
-        </w:rPr>
-      </w:pPr>
-      <w:r>
-        <w:rPr>
-          <w:rFonts w:eastAsia="Times New Roman"/>
-        </w:rPr>
-        <w:t xml:space="preserve">• </w:t>
-      </w:r>
-      <w:proofErr w:type="gramStart"/>
-      <w:r>
-        <w:rPr>
-          <w:rFonts w:eastAsia="Times New Roman"/>
-        </w:rPr>
-        <w:t>integración</w:t>
-      </w:r>
-      <w:proofErr w:type="gramEnd"/>
-      <w:r>
-        <w:rPr>
-          <w:rFonts w:eastAsia="Times New Roman"/>
-        </w:rPr>
-        <w:t xml:space="preserve"> de módulos de analítica y tableros de control sobre la cartera de proyectos del Departamento;</w:t>
-      </w:r>
-    </w:p>
-    <w:p>
-      <w:pPr>
-        <w:ind w:left="708"/>
-        <w:rPr>
-          <w:rFonts w:eastAsia="Times New Roman"/>
-        </w:rPr>
-      </w:pPr>
-      <w:r>
-        <w:rPr>
-          <w:rFonts w:eastAsia="Times New Roman"/>
-        </w:rPr>
-        <w:t xml:space="preserve">• </w:t>
-      </w:r>
-      <w:proofErr w:type="gramStart"/>
-      <w:r>
-        <w:rPr>
-          <w:rFonts w:eastAsia="Times New Roman"/>
-        </w:rPr>
-        <w:t>definición</w:t>
-      </w:r>
-      <w:proofErr w:type="gramEnd"/>
-      <w:r>
-        <w:rPr>
-          <w:rFonts w:eastAsia="Times New Roman"/>
-        </w:rPr>
-        <w:t xml:space="preserve"> de paneles visuales para el seguimiento del estado de solicitudes, tiempos de respuesta y volumen de trabajo;</w:t>
-      </w:r>
-    </w:p>
-    <w:p>
-      <w:pPr>
-        <w:ind w:left="708"/>
-        <w:rPr>
-          <w:rFonts w:eastAsia="Times New Roman"/>
-        </w:rPr>
-      </w:pPr>
-      <w:r>
-        <w:rPr>
-          <w:rFonts w:eastAsia="Times New Roman"/>
-        </w:rPr>
-        <w:t xml:space="preserve">• </w:t>
-      </w:r>
-      <w:proofErr w:type="gramStart"/>
-      <w:r>
-        <w:rPr>
-          <w:rFonts w:eastAsia="Times New Roman"/>
-        </w:rPr>
-        <w:t>utilización</w:t>
-      </w:r>
-      <w:proofErr w:type="gramEnd"/>
-      <w:r>
-        <w:rPr>
-          <w:rFonts w:eastAsia="Times New Roman"/>
-        </w:rPr>
-        <w:t xml:space="preserve"> de métricas objetivas para informar la evolución de las iniciativas a las autoridades municipales.</w:t>
-      </w:r>
-    </w:p>
-    <w:p>
-      <w:pPr>
-        <w:ind w:left="708"/>
-        <w:rPr>
-          <w:rFonts w:eastAsia="Times New Roman"/>
-          <w:b/>
-          <w:sz w:val="24"/>
-          <w:szCs w:val="24"/>
-        </w:rPr>
-      </w:pPr>
-    </w:p>
-    <w:p>
-      <w:pPr>
-        <w:pStyle w:val="Ttulo2"/>
-        <w:rPr>
-          <w:b/>
-          <w:sz w:val="24"/>
-          <w:szCs w:val="24"/>
-        </w:rPr>
-      </w:pPr>
-      <w:r>
-        <w:rPr>
-          <w:b/>
-          <w:sz w:val="24"/>
-          <w:szCs w:val="24"/>
-        </w:rPr>
-        <w:t>Resultado esperado</w:t>
-      </w:r>
-    </w:p>
-    <w:p>
-      <w:pPr>
-        <w:pStyle w:val="Ttulo2"/>
-        <w:rPr>
-          <w:rFonts w:eastAsia="Times New Roman"/>
-          <w:color w:val="auto"/>
-          <w:sz w:val="22"/>
-          <w:szCs w:val="22"/>
-        </w:rPr>
-      </w:pPr>
-      <w:r>
-        <w:rPr>
-          <w:rFonts w:eastAsia="Times New Roman"/>
-          <w:color w:val="auto"/>
-          <w:sz w:val="22"/>
-          <w:szCs w:val="22"/>
-        </w:rPr>
-        <w:t>Se obtendrá visibilidad gerencial completa sobre la capacidad operativa del Departamento, optimizando la asignación de recursos y sustentando la toma de decisiones en evidencia objetiva.</w:t>
-      </w:r>
-    </w:p>
-    <w:p>
-      <w:pPr>
-        <w:pStyle w:val="Ttulo2"/>
-      </w:pPr>
-    </w:p>
-    <w:p>
-      <w:pPr>
-        <w:pStyle w:val="Ttulo2"/>
-        <w:rPr>
-          <w:b/>
-        </w:rPr>
-      </w:pPr>
-      <w:r>
-        <w:rPr>
-          <w:b/>
-        </w:rPr>
-        <w:t>6.6 Fortalecimiento gradual de la estructura técnica y especialización funcional</w:t>
-      </w:r>
-    </w:p>
-    <w:p>
-      <w:pPr>
-        <w:pStyle w:val="Ttulo2"/>
-        <w:rPr>
-          <w:b/>
-          <w:sz w:val="24"/>
-          <w:szCs w:val="24"/>
-        </w:rPr>
-      </w:pPr>
-      <w:r>
-        <w:rPr>
-          <w:b/>
-          <w:sz w:val="24"/>
-          <w:szCs w:val="24"/>
-        </w:rPr>
-        <w:t>Problema</w:t>
-      </w:r>
-    </w:p>
-    <w:p>
-      <w:pPr>
-        <w:pStyle w:val="Ttulo2"/>
-        <w:rPr>
-          <w:rFonts w:eastAsia="Times New Roman"/>
-          <w:color w:val="auto"/>
-          <w:sz w:val="22"/>
-          <w:szCs w:val="22"/>
-        </w:rPr>
-      </w:pPr>
-      <w:r>
-        <w:rPr>
-          <w:rFonts w:eastAsia="Times New Roman"/>
-          <w:color w:val="auto"/>
-          <w:sz w:val="22"/>
-          <w:szCs w:val="22"/>
-        </w:rPr>
-        <w:t>La dotación actual limita la posibilidad de asignar responsabilidades especializadas en análisis funcional, arquitectura de software, calidad y liderazgo técnico, obligando a los agentes a desempeñar simultáneamente múltiples funciones.</w:t>
-      </w:r>
-    </w:p>
-    <w:p>
-      <w:pPr>
-        <w:pStyle w:val="Ttulo2"/>
-        <w:rPr>
-          <w:b/>
-          <w:sz w:val="24"/>
-          <w:szCs w:val="24"/>
-        </w:rPr>
-      </w:pPr>
-      <w:r>
-        <w:rPr>
-          <w:b/>
-        </w:rPr>
-        <w:br/>
-      </w:r>
-      <w:r>
-        <w:rPr>
-          <w:b/>
-          <w:sz w:val="24"/>
-          <w:szCs w:val="24"/>
-        </w:rPr>
-        <w:t>Propuesta</w:t>
-      </w:r>
-    </w:p>
-    <w:p>
-      <w:pPr>
-        <w:pStyle w:val="Ttulo2"/>
-        <w:rPr>
-          <w:rFonts w:eastAsia="Times New Roman"/>
-          <w:color w:val="auto"/>
-          <w:sz w:val="22"/>
-          <w:szCs w:val="22"/>
-        </w:rPr>
-      </w:pPr>
-      <w:r>
-        <w:rPr>
-          <w:rFonts w:eastAsia="Times New Roman"/>
-          <w:color w:val="auto"/>
-          <w:sz w:val="22"/>
-          <w:szCs w:val="22"/>
-        </w:rPr>
-        <w:t>En función de la disponibilidad presupuestaria e incorporar recursos humanos, fortalecer progresivamente la estructura técnica del Departamento mediante la incorporación de perfiles profesionales que permitan consolidar una mayor especialización funcional y una mejor distribución de responsabilidades.</w:t>
-      </w:r>
-    </w:p>
-    <w:p>
-      <w:pPr>
-        <w:pStyle w:val="Ttulo2"/>
-      </w:pPr>
-    </w:p>
-    <w:p>
-      <w:pPr>
-        <w:pStyle w:val="Ttulo2"/>
-        <w:rPr>
-          <w:b/>
-          <w:sz w:val="24"/>
-          <w:szCs w:val="24"/>
-        </w:rPr>
-      </w:pPr>
-      <w:r>
-        <w:rPr>
-          <w:b/>
-          <w:sz w:val="24"/>
-          <w:szCs w:val="24"/>
-        </w:rPr>
-        <w:t>Implementación</w:t>
-      </w:r>
-    </w:p>
-    <w:p>
-      <w:pPr>
-        <w:rPr>
-          <w:rFonts w:eastAsia="Times New Roman"/>
-        </w:rPr>
-      </w:pPr>
-      <w:r>
-        <w:rPr>
-          <w:rFonts w:eastAsia="Times New Roman"/>
-        </w:rPr>
-        <w:t>La implementación comprenderá:</w:t>
-      </w:r>
-    </w:p>
-    <w:p>
-      <w:pPr>
-        <w:ind w:left="708"/>
-        <w:rPr>
-          <w:rFonts w:eastAsia="Times New Roman"/>
-        </w:rPr>
-      </w:pPr>
-      <w:r>
-        <w:rPr>
-          <w:rFonts w:eastAsia="Times New Roman"/>
-        </w:rPr>
-        <w:t xml:space="preserve">• </w:t>
-      </w:r>
-      <w:proofErr w:type="gramStart"/>
-      <w:r>
-        <w:rPr>
-          <w:rFonts w:eastAsia="Times New Roman"/>
-        </w:rPr>
-        <w:t>incorporación</w:t>
-      </w:r>
-      <w:proofErr w:type="gramEnd"/>
-      <w:r>
-        <w:rPr>
-          <w:rFonts w:eastAsia="Times New Roman"/>
-        </w:rPr>
-        <w:t xml:space="preserve"> gradual de perfiles técnicos dedicados al desarrollo de software;</w:t>
-      </w:r>
-    </w:p>
-    <w:p>
-      <w:pPr>
-        <w:ind w:left="708"/>
-        <w:rPr>
-          <w:rFonts w:eastAsia="Times New Roman"/>
-        </w:rPr>
-      </w:pPr>
-      <w:r>
-        <w:rPr>
-          <w:rFonts w:eastAsia="Times New Roman"/>
-        </w:rPr>
-        <w:t xml:space="preserve">• </w:t>
-      </w:r>
-      <w:proofErr w:type="gramStart"/>
-      <w:r>
-        <w:rPr>
-          <w:rFonts w:eastAsia="Times New Roman"/>
-        </w:rPr>
-        <w:t>fortalecimiento</w:t>
-      </w:r>
-      <w:proofErr w:type="gramEnd"/>
-      <w:r>
-        <w:rPr>
-          <w:rFonts w:eastAsia="Times New Roman"/>
-        </w:rPr>
-        <w:t xml:space="preserve"> de las funciones de análisis funcional, arquitectura y aseguramiento de calidad asignadas a los perfiles de mayor experiencia;</w:t>
-      </w:r>
-    </w:p>
-    <w:p>
-      <w:pPr>
-        <w:ind w:left="708"/>
-        <w:rPr>
-          <w:rFonts w:eastAsia="Times New Roman"/>
-        </w:rPr>
-      </w:pPr>
-      <w:r>
-        <w:rPr>
-          <w:rFonts w:eastAsia="Times New Roman"/>
-        </w:rPr>
-        <w:t xml:space="preserve">• </w:t>
-      </w:r>
-      <w:proofErr w:type="gramStart"/>
-      <w:r>
-        <w:rPr>
-          <w:rFonts w:eastAsia="Times New Roman"/>
-        </w:rPr>
-        <w:t>conformación</w:t>
-      </w:r>
-      <w:proofErr w:type="gramEnd"/>
-      <w:r>
-        <w:rPr>
-          <w:rFonts w:eastAsia="Times New Roman"/>
-        </w:rPr>
-        <w:t xml:space="preserve"> de equipos con responsabilidades claramente definidas y esquemas de </w:t>
-      </w:r>
-      <w:proofErr w:type="spellStart"/>
-      <w:r>
-        <w:rPr>
-          <w:rFonts w:eastAsia="Times New Roman"/>
-        </w:rPr>
-        <w:t>mentoría</w:t>
-      </w:r>
-      <w:proofErr w:type="spellEnd"/>
-      <w:r>
-        <w:rPr>
-          <w:rFonts w:eastAsia="Times New Roman"/>
-        </w:rPr>
-        <w:t xml:space="preserve"> hacia el personal de reciente ingreso;</w:t>
-      </w:r>
-    </w:p>
-    <w:p>
-      <w:pPr>
-        <w:ind w:left="708"/>
-        <w:rPr>
-          <w:rFonts w:eastAsia="Times New Roman"/>
-        </w:rPr>
-      </w:pPr>
-      <w:r>
-        <w:rPr>
-          <w:rFonts w:eastAsia="Times New Roman"/>
-        </w:rPr>
-        <w:t xml:space="preserve">• </w:t>
-      </w:r>
-      <w:proofErr w:type="gramStart"/>
-      <w:r>
-        <w:rPr>
-          <w:rFonts w:eastAsia="Times New Roman"/>
-        </w:rPr>
-        <w:t>evaluación</w:t>
-      </w:r>
-      <w:proofErr w:type="gramEnd"/>
-      <w:r>
-        <w:rPr>
-          <w:rFonts w:eastAsia="Times New Roman"/>
-        </w:rPr>
-        <w:t xml:space="preserve"> periódica de la capacidad operativa y cohesión de los grupos de trabajo.</w:t>
-      </w:r>
-    </w:p>
-    <w:p>
-      <w:pPr>
-        <w:rPr>
-          <w:rFonts w:eastAsia="Times New Roman"/>
-        </w:rPr>
-      </w:pPr>
-    </w:p>
-    <w:p>
-      <w:pPr>
-        <w:pStyle w:val="Ttulo2"/>
-        <w:rPr>
-          <w:b/>
-          <w:sz w:val="24"/>
-          <w:szCs w:val="24"/>
-        </w:rPr>
-      </w:pPr>
-      <w:r>
-        <w:rPr>
-          <w:b/>
-          <w:sz w:val="24"/>
-          <w:szCs w:val="24"/>
-        </w:rPr>
-        <w:t>Resultado esperado</w:t>
-      </w:r>
-    </w:p>
-    <w:p>
-      <w:pPr>
-        <w:rPr>
-          <w:rFonts w:eastAsia="Times New Roman"/>
-        </w:rPr>
-      </w:pPr>
-      <w:r>
-        <w:rPr>
-          <w:rFonts w:eastAsia="Times New Roman"/>
-        </w:rPr>
         <w:t>Se optimizará la distribución de responsabilidades, aumentará la capacidad operativa del Departamento para responder a nuevas demandas y se preservará sostenidamente el conocimiento del negocio municipal.</w:t>
       </w:r>
     </w:p>
@@ -6005,405 +6261,465 @@
         <w:rPr>
           <w:rFonts w:eastAsia="Times New Roman"/>
         </w:rPr>
+        <w:t>Se i</w:t>
+      </w:r>
+      <w:r>
+        <w:rPr>
+          <w:rFonts w:eastAsia="Times New Roman"/>
+        </w:rPr>
+        <w:t>mplementar</w:t>
+      </w:r>
+      <w:r>
+        <w:rPr>
+          <w:rFonts w:eastAsia="Times New Roman"/>
+        </w:rPr>
+        <w:t>án</w:t>
+      </w:r>
+      <w:r>
+        <w:rPr>
+          <w:rFonts w:eastAsia="Times New Roman"/>
+        </w:rPr>
+        <w:t xml:space="preserve"> las propuestas de manera progresiva, procurando incorporar las mejoras al funcionamiento habitual del Departamento sin afectar la continuid</w:t>
+      </w:r>
+      <w:r>
+        <w:rPr>
+          <w:rFonts w:eastAsia="Times New Roman"/>
+        </w:rPr>
+        <w:t>ad de los servicios que presta.</w:t>
+      </w:r>
+    </w:p>
+    <w:p>
+      <w:pPr>
+        <w:rPr>
+          <w:rFonts w:eastAsia="Times New Roman"/>
+        </w:rPr>
+      </w:pPr>
+      <w:r>
+        <w:rPr>
+          <w:rFonts w:eastAsia="Times New Roman"/>
+        </w:rPr>
+        <w:t xml:space="preserve">Las líneas de acción no requieren una implementación simultánea. </w:t>
+      </w:r>
+      <w:r>
+        <w:rPr>
+          <w:rFonts w:eastAsia="Times New Roman"/>
+        </w:rPr>
+        <w:t>Determinaré el orden de incorporación según la criticidad de los sistemas, las prioridades institucionales, la capacidad operativa y los resultados obten</w:t>
+      </w:r>
+      <w:r>
+        <w:rPr>
+          <w:rFonts w:eastAsia="Times New Roman"/>
+        </w:rPr>
+        <w:t>idos</w:t>
+      </w:r>
+    </w:p>
+    <w:p>
+      <w:pPr>
+        <w:rPr>
+          <w:rFonts w:eastAsia="Times New Roman"/>
+        </w:rPr>
+      </w:pPr>
+      <w:r>
+        <w:rPr>
+          <w:rFonts w:eastAsia="Times New Roman"/>
+        </w:rPr>
+        <w:t>De esta manera, el p</w:t>
+      </w:r>
+      <w:r>
+        <w:rPr>
+          <w:rFonts w:eastAsia="Times New Roman"/>
+        </w:rPr>
+        <w:t>lan constituye un marco de gestión adaptable a las necesidades del área y no un cronograma rígido de ejecución. Las prioridades se revisarán cuando surjan requerimientos normativos, incidencias críticas, nuevos proyectos o cambios en la disponibilidad de recursos.</w:t>
+      </w:r>
+    </w:p>
+    <w:p/>
+    <w:p>
+      <w:pPr>
+        <w:pStyle w:val="Ttulo2"/>
+        <w:rPr>
+          <w:b/>
+        </w:rPr>
+      </w:pPr>
+      <w:r>
+        <w:rPr>
+          <w:b/>
+        </w:rPr>
+        <w:t>7.1 Puesta en marcha</w:t>
+      </w:r>
+    </w:p>
+    <w:p>
+      <w:pPr>
+        <w:rPr>
+          <w:rFonts w:eastAsia="Times New Roman"/>
+        </w:rPr>
+      </w:pPr>
+      <w:r>
+        <w:rPr>
+          <w:rFonts w:eastAsia="Times New Roman"/>
+        </w:rPr>
+        <w:t xml:space="preserve">La puesta en marcha establecerá las condiciones organizacionales para aplicar las medidas propuestas, priorizando acciones </w:t>
+      </w:r>
+      <w:proofErr w:type="spellStart"/>
+      <w:r>
+        <w:rPr>
+          <w:rFonts w:eastAsia="Times New Roman"/>
+        </w:rPr>
+        <w:t>implementables</w:t>
+      </w:r>
+      <w:proofErr w:type="spellEnd"/>
+      <w:r>
+        <w:rPr>
+          <w:rFonts w:eastAsia="Times New Roman"/>
+        </w:rPr>
+        <w:t xml:space="preserve"> con los recursos y herram</w:t>
+      </w:r>
+      <w:r>
+        <w:rPr>
+          <w:rFonts w:eastAsia="Times New Roman"/>
+        </w:rPr>
+        <w:t>ientas actualmente disponibles.</w:t>
+      </w:r>
+    </w:p>
+    <w:p>
+      <w:pPr>
+        <w:rPr>
+          <w:rFonts w:eastAsia="Times New Roman"/>
+        </w:rPr>
+      </w:pPr>
+      <w:r>
+        <w:rPr>
+          <w:rFonts w:eastAsia="Times New Roman"/>
+        </w:rPr>
+        <w:t>Se realizará</w:t>
+      </w:r>
+      <w:r>
+        <w:rPr>
+          <w:rFonts w:eastAsia="Times New Roman"/>
+        </w:rPr>
+        <w:t xml:space="preserve"> un relevamiento operativo del Departamento que comprenderá: la cartera de proyectos y requerimientos, sistemas críticos, distribución del conocimiento, experiencia del personal, estado de documentación, integraciones entre sistemas y capacidad</w:t>
+      </w:r>
+      <w:r>
+        <w:rPr>
+          <w:rFonts w:eastAsia="Times New Roman"/>
+        </w:rPr>
+        <w:t xml:space="preserve"> operativa disponible.</w:t>
+      </w:r>
+    </w:p>
+    <w:p>
+      <w:pPr>
+        <w:rPr>
+          <w:rFonts w:eastAsia="Times New Roman"/>
+        </w:rPr>
+      </w:pPr>
+      <w:r>
+        <w:rPr>
+          <w:rFonts w:eastAsia="Times New Roman"/>
+        </w:rPr>
+        <w:t xml:space="preserve">A partir de esta información </w:t>
+      </w:r>
+      <w:r>
+        <w:rPr>
+          <w:rFonts w:eastAsia="Times New Roman"/>
+        </w:rPr>
+        <w:t xml:space="preserve">se </w:t>
+      </w:r>
+      <w:r>
+        <w:rPr>
+          <w:rFonts w:eastAsia="Times New Roman"/>
+        </w:rPr>
+        <w:t>establecer</w:t>
+      </w:r>
+      <w:r>
+        <w:rPr>
+          <w:rFonts w:eastAsia="Times New Roman"/>
+        </w:rPr>
+        <w:t>án</w:t>
+      </w:r>
+      <w:r>
+        <w:rPr>
+          <w:rFonts w:eastAsia="Times New Roman"/>
+        </w:rPr>
+        <w:t xml:space="preserve"> las prioridades de intervención, los riesgos operativos y las primeras medidas a implementar, contando con una visión objetiva para avanzar sobre las restantes líneas de mejora.</w:t>
+      </w:r>
+    </w:p>
+    <w:p>
+      <w:pPr>
+        <w:rPr>
+          <w:rFonts w:eastAsia="Times New Roman"/>
+          <w:sz w:val="24"/>
+          <w:szCs w:val="24"/>
+        </w:rPr>
+      </w:pPr>
+    </w:p>
+    <w:p>
+      <w:pPr>
+        <w:pStyle w:val="Ttulo2"/>
+        <w:rPr>
+          <w:b/>
+        </w:rPr>
+      </w:pPr>
+      <w:r>
+        <w:rPr>
+          <w:b/>
+        </w:rPr>
+        <w:t>7.2 Implementación progresiva</w:t>
+      </w:r>
+    </w:p>
+    <w:p>
+      <w:pPr>
+        <w:rPr>
+          <w:rFonts w:eastAsia="Times New Roman"/>
+        </w:rPr>
+      </w:pPr>
+      <w:r>
+        <w:rPr>
+          <w:rFonts w:eastAsia="Times New Roman"/>
+        </w:rPr>
+        <w:t>Las medidas se incorporarán de acuerdo con las posibilidades del Departamento, priorizando acciones de impacto organizacional que puedan desarrollarse sin comprometer requerimientos críticos.</w:t>
+      </w:r>
+    </w:p>
+    <w:p>
+      <w:pPr>
+        <w:rPr>
+          <w:rFonts w:eastAsia="Times New Roman"/>
+        </w:rPr>
+      </w:pPr>
+      <w:r>
+        <w:rPr>
+          <w:rFonts w:eastAsia="Times New Roman"/>
+        </w:rPr>
+        <w:t>E</w:t>
+      </w:r>
+      <w:r>
+        <w:rPr>
+          <w:rFonts w:eastAsia="Times New Roman"/>
+        </w:rPr>
+        <w:t>ntre las medidas que se incorporarán</w:t>
+      </w:r>
+      <w:r>
+        <w:rPr>
+          <w:rFonts w:eastAsia="Times New Roman"/>
+        </w:rPr>
+        <w:t xml:space="preserve"> se encuentran:</w:t>
+      </w:r>
+    </w:p>
+    <w:p>
+      <w:pPr>
+        <w:ind w:left="708"/>
+        <w:rPr>
+          <w:rFonts w:eastAsia="Times New Roman"/>
+        </w:rPr>
+      </w:pPr>
+      <w:r>
+        <w:rPr>
+          <w:rFonts w:eastAsia="Times New Roman"/>
+        </w:rPr>
+        <w:t xml:space="preserve">• </w:t>
+      </w:r>
+      <w:proofErr w:type="gramStart"/>
+      <w:r>
+        <w:rPr>
+          <w:rFonts w:eastAsia="Times New Roman"/>
+        </w:rPr>
+        <w:t>fortalecimiento</w:t>
+      </w:r>
+      <w:proofErr w:type="gramEnd"/>
+      <w:r>
+        <w:rPr>
+          <w:rFonts w:eastAsia="Times New Roman"/>
+        </w:rPr>
+        <w:t xml:space="preserve"> de la planificación y gestión de requerimientos;</w:t>
+      </w:r>
+    </w:p>
+    <w:p>
+      <w:pPr>
+        <w:ind w:left="708"/>
+        <w:rPr>
+          <w:rFonts w:eastAsia="Times New Roman"/>
+        </w:rPr>
+      </w:pPr>
+      <w:r>
+        <w:rPr>
+          <w:rFonts w:eastAsia="Times New Roman"/>
+        </w:rPr>
+        <w:t xml:space="preserve">• </w:t>
+      </w:r>
+      <w:proofErr w:type="gramStart"/>
+      <w:r>
+        <w:rPr>
+          <w:rFonts w:eastAsia="Times New Roman"/>
+        </w:rPr>
+        <w:t>transferencia</w:t>
+      </w:r>
+      <w:proofErr w:type="gramEnd"/>
+      <w:r>
+        <w:rPr>
+          <w:rFonts w:eastAsia="Times New Roman"/>
+        </w:rPr>
+        <w:t xml:space="preserve"> y preservación del conocimiento institucional;</w:t>
+      </w:r>
+    </w:p>
+    <w:p>
+      <w:pPr>
+        <w:ind w:left="708"/>
+        <w:rPr>
+          <w:rFonts w:eastAsia="Times New Roman"/>
+        </w:rPr>
+      </w:pPr>
+      <w:r>
+        <w:rPr>
+          <w:rFonts w:eastAsia="Times New Roman"/>
+        </w:rPr>
+        <w:t xml:space="preserve">• </w:t>
+      </w:r>
+      <w:proofErr w:type="gramStart"/>
+      <w:r>
+        <w:rPr>
+          <w:rFonts w:eastAsia="Times New Roman"/>
+        </w:rPr>
+        <w:t>incorporación</w:t>
+      </w:r>
+      <w:proofErr w:type="gramEnd"/>
+      <w:r>
+        <w:rPr>
+          <w:rFonts w:eastAsia="Times New Roman"/>
+        </w:rPr>
+        <w:t xml:space="preserve"> progresiva de estándares técnicos y criterios comunes de desarrollo;</w:t>
+      </w:r>
+    </w:p>
+    <w:p>
+      <w:pPr>
+        <w:ind w:left="708"/>
+        <w:rPr>
+          <w:rFonts w:eastAsia="Times New Roman"/>
+        </w:rPr>
+      </w:pPr>
+      <w:r>
+        <w:rPr>
+          <w:rFonts w:eastAsia="Times New Roman"/>
+        </w:rPr>
+        <w:t xml:space="preserve">• </w:t>
+      </w:r>
+      <w:proofErr w:type="gramStart"/>
+      <w:r>
+        <w:rPr>
+          <w:rFonts w:eastAsia="Times New Roman"/>
+        </w:rPr>
+        <w:t>fortalecimiento</w:t>
+      </w:r>
+      <w:proofErr w:type="gramEnd"/>
+      <w:r>
+        <w:rPr>
+          <w:rFonts w:eastAsia="Times New Roman"/>
+        </w:rPr>
+        <w:t xml:space="preserve"> de la coordinación entre equipos;</w:t>
+      </w:r>
+    </w:p>
+    <w:p>
+      <w:pPr>
+        <w:ind w:left="708"/>
+        <w:rPr>
+          <w:rFonts w:eastAsia="Times New Roman"/>
+        </w:rPr>
+      </w:pPr>
+      <w:r>
+        <w:rPr>
+          <w:rFonts w:eastAsia="Times New Roman"/>
+        </w:rPr>
+        <w:t xml:space="preserve">• </w:t>
+      </w:r>
+      <w:proofErr w:type="gramStart"/>
+      <w:r>
+        <w:rPr>
+          <w:rFonts w:eastAsia="Times New Roman"/>
+        </w:rPr>
+        <w:t>formalización</w:t>
+      </w:r>
+      <w:proofErr w:type="gramEnd"/>
+      <w:r>
+        <w:rPr>
+          <w:rFonts w:eastAsia="Times New Roman"/>
+        </w:rPr>
+        <w:t xml:space="preserve"> del seguimiento técnico de proveedores externos;</w:t>
+      </w:r>
+    </w:p>
+    <w:p>
+      <w:pPr>
+        <w:ind w:left="708"/>
+        <w:rPr>
+          <w:rFonts w:eastAsia="Times New Roman"/>
+        </w:rPr>
+      </w:pPr>
+      <w:r>
+        <w:rPr>
+          <w:rFonts w:eastAsia="Times New Roman"/>
+        </w:rPr>
+        <w:t xml:space="preserve">• </w:t>
+      </w:r>
+      <w:proofErr w:type="gramStart"/>
+      <w:r>
+        <w:rPr>
+          <w:rFonts w:eastAsia="Times New Roman"/>
+        </w:rPr>
+        <w:t>incorporación</w:t>
+      </w:r>
+      <w:proofErr w:type="gramEnd"/>
+      <w:r>
+        <w:rPr>
+          <w:rFonts w:eastAsia="Times New Roman"/>
+        </w:rPr>
+        <w:t xml:space="preserve"> gradual de nuevas herramientas y tecnologías;</w:t>
+      </w:r>
+    </w:p>
+    <w:p>
+      <w:pPr>
+        <w:ind w:left="708"/>
+        <w:rPr>
+          <w:rFonts w:eastAsia="Times New Roman"/>
+        </w:rPr>
+      </w:pPr>
+      <w:r>
+        <w:rPr>
+          <w:rFonts w:eastAsia="Times New Roman"/>
+        </w:rPr>
+        <w:t xml:space="preserve">• </w:t>
+      </w:r>
+      <w:proofErr w:type="gramStart"/>
+      <w:r>
+        <w:rPr>
+          <w:rFonts w:eastAsia="Times New Roman"/>
+        </w:rPr>
+        <w:t>preparación</w:t>
+      </w:r>
+      <w:proofErr w:type="gramEnd"/>
+      <w:r>
+        <w:rPr>
+          <w:rFonts w:eastAsia="Times New Roman"/>
+        </w:rPr>
+        <w:t xml:space="preserve"> de futuras iniciativas de inversión cuando existan recursos presupuestarios disponibles.</w:t>
+      </w:r>
+    </w:p>
+    <w:p>
+      <w:r>
+        <w:rPr>
+          <w:rFonts w:eastAsia="Times New Roman"/>
+        </w:rPr>
+        <w:t>La incorporación de cada medida será acompañada por la evaluación de sus resultados y por los ajustes que sean necesarios para adecuarla a la realidad operativa del Departamento.</w:t>
+      </w:r>
+    </w:p>
+    <w:p/>
+    <w:p>
+      <w:pPr>
+        <w:pStyle w:val="Ttulo2"/>
+        <w:rPr>
+          <w:b/>
+        </w:rPr>
+      </w:pPr>
+      <w:r>
+        <w:rPr>
+          <w:b/>
+        </w:rPr>
         <w:lastRenderedPageBreak/>
-        <w:t>Implementaré las propuestas de manera progresiva, procurando incorporar las mejoras al funcionamiento habitual del Departamento sin afectar la continuid</w:t>
-      </w:r>
-      <w:r>
-        <w:rPr>
-          <w:rFonts w:eastAsia="Times New Roman"/>
-        </w:rPr>
-        <w:t>ad de los servicios que presta.</w:t>
-      </w:r>
-    </w:p>
-    <w:p>
-      <w:pPr>
-        <w:rPr>
-          <w:rFonts w:eastAsia="Times New Roman"/>
-        </w:rPr>
-      </w:pPr>
-      <w:r>
-        <w:rPr>
-          <w:rFonts w:eastAsia="Times New Roman"/>
-        </w:rPr>
-        <w:t xml:space="preserve">Las líneas de acción no requieren una implementación simultánea. </w:t>
-      </w:r>
-      <w:r>
-        <w:rPr>
-          <w:rFonts w:eastAsia="Times New Roman"/>
-        </w:rPr>
-        <w:t xml:space="preserve">Determinaré el orden de incorporación según la criticidad de los sistemas, las prioridades institucionales, la capacidad operativa y los resultados obten</w:t>
-      </w:r>
-      <w:r>
-        <w:rPr>
-          <w:rFonts w:eastAsia="Times New Roman"/>
-        </w:rPr>
-        <w:t>idos</w:t>
-      </w:r>
-    </w:p>
-    <w:p>
-      <w:pPr>
-        <w:rPr>
-          <w:rFonts w:eastAsia="Times New Roman"/>
-        </w:rPr>
-      </w:pPr>
-      <w:r>
-        <w:rPr>
-          <w:rFonts w:eastAsia="Times New Roman"/>
-        </w:rPr>
-        <w:t>De esta manera, el p</w:t>
-      </w:r>
-      <w:r>
-        <w:rPr>
-          <w:rFonts w:eastAsia="Times New Roman"/>
-        </w:rPr>
-        <w:t>lan constituye un marco de gestión adaptable a las necesidades del área y no un cronograma rígido de ejecución. Las prioridades se revisarán cuando surjan requerimientos normativos, incidencias críticas, nuevos proyectos o cambios en la disponibilidad de recursos.</w:t>
-      </w:r>
-    </w:p>
-    <w:p/>
-    <w:p>
-      <w:pPr>
-        <w:pStyle w:val="Ttulo2"/>
-        <w:rPr>
-          <w:b/>
-        </w:rPr>
-      </w:pPr>
-      <w:r>
-        <w:rPr>
-          <w:b/>
-        </w:rPr>
-        <w:t>7.1 Puesta en marcha</w:t>
-      </w:r>
-    </w:p>
-    <w:p>
-      <w:pPr>
-        <w:rPr>
-          <w:rFonts w:eastAsia="Times New Roman"/>
-        </w:rPr>
-      </w:pPr>
-      <w:r>
-        <w:rPr>
-          <w:rFonts w:eastAsia="Times New Roman"/>
-        </w:rPr>
-        <w:t xml:space="preserve">La puesta en marcha establecerá las condiciones organizacionales para aplicar las medidas propuestas, priorizando acciones </w:t>
-      </w:r>
-      <w:proofErr w:type="spellStart"/>
-      <w:r>
-        <w:rPr>
-          <w:rFonts w:eastAsia="Times New Roman"/>
-        </w:rPr>
-        <w:t>implementables</w:t>
-      </w:r>
-      <w:proofErr w:type="spellEnd"/>
-      <w:r>
-        <w:rPr>
-          <w:rFonts w:eastAsia="Times New Roman"/>
-        </w:rPr>
-        <w:t xml:space="preserve"> con los recursos y herram</w:t>
-      </w:r>
-      <w:r>
-        <w:rPr>
-          <w:rFonts w:eastAsia="Times New Roman"/>
-        </w:rPr>
-        <w:t>ientas actualmente disponibles.</w:t>
-      </w:r>
-    </w:p>
-    <w:p>
-      <w:pPr>
-        <w:rPr>
-          <w:rFonts w:eastAsia="Times New Roman"/>
-        </w:rPr>
-      </w:pPr>
-      <w:r>
-        <w:rPr>
-          <w:rFonts w:eastAsia="Times New Roman"/>
-        </w:rPr>
-        <w:t>Realizaré un relevamiento operativo del Departamento que comprenderá: la cartera de proyectos y requerimientos, sistemas críticos, distribución del conocimiento, experiencia del personal, estado de documentación, integraciones entre sistemas y capacidad</w:t>
-      </w:r>
-      <w:r>
-        <w:rPr>
-          <w:rFonts w:eastAsia="Times New Roman"/>
-        </w:rPr>
-        <w:t xml:space="preserve"> operativa disponible.</w:t>
-      </w:r>
-    </w:p>
-    <w:p>
-      <w:pPr>
-        <w:rPr>
-          <w:rFonts w:eastAsia="Times New Roman"/>
-        </w:rPr>
-      </w:pPr>
-      <w:r>
-        <w:rPr>
-          <w:rFonts w:eastAsia="Times New Roman"/>
-        </w:rPr>
-        <w:t>A partir de esta información estableceré las prioridades de intervención, los riesgos operativos y las primeras medidas a implementar, contando con una visión objetiva para avanzar sobre las restantes líneas de mejora.</w:t>
-      </w:r>
-    </w:p>
-    <w:p>
-      <w:pPr>
-        <w:rPr>
-          <w:rFonts w:eastAsia="Times New Roman"/>
-          <w:sz w:val="24"/>
-          <w:szCs w:val="24"/>
-        </w:rPr>
-      </w:pPr>
-    </w:p>
-    <w:p>
-      <w:pPr>
-        <w:pStyle w:val="Ttulo2"/>
-        <w:rPr>
-          <w:b/>
-        </w:rPr>
-      </w:pPr>
-      <w:r>
-        <w:rPr>
-          <w:b/>
-        </w:rPr>
-        <w:t>7.2 Implementación progresiva</w:t>
-      </w:r>
-    </w:p>
-    <w:p>
-      <w:pPr>
-        <w:rPr>
-          <w:rFonts w:eastAsia="Times New Roman"/>
-        </w:rPr>
-      </w:pPr>
-      <w:r>
-        <w:rPr>
-          <w:rFonts w:eastAsia="Times New Roman"/>
-        </w:rPr>
-        <w:t>Las medidas se incorporarán de acuerdo con las posibilidades del Departamento, priorizando acciones de impacto organizacional que puedan desarrollarse sin comprometer requerimientos críticos.</w:t>
-      </w:r>
-    </w:p>
-    <w:p>
-      <w:pPr>
-        <w:rPr>
-          <w:rFonts w:eastAsia="Times New Roman"/>
-        </w:rPr>
-      </w:pPr>
-      <w:r>
-        <w:rPr>
-          <w:rFonts w:eastAsia="Times New Roman"/>
-        </w:rPr>
-        <w:t>Entre las medidas que incorporaré, de acuerdo con las prioridades que determine, se encuentran:</w:t>
-      </w:r>
-    </w:p>
-    <w:p>
-      <w:pPr>
-        <w:ind w:left="708"/>
-        <w:rPr>
-          <w:rFonts w:eastAsia="Times New Roman"/>
-        </w:rPr>
-      </w:pPr>
-      <w:r>
-        <w:rPr>
-          <w:rFonts w:eastAsia="Times New Roman"/>
-        </w:rPr>
-        <w:t xml:space="preserve">• </w:t>
-      </w:r>
-      <w:proofErr w:type="gramStart"/>
-      <w:r>
-        <w:rPr>
-          <w:rFonts w:eastAsia="Times New Roman"/>
-        </w:rPr>
-        <w:t>fortalecimiento</w:t>
-      </w:r>
-      <w:proofErr w:type="gramEnd"/>
-      <w:r>
-        <w:rPr>
-          <w:rFonts w:eastAsia="Times New Roman"/>
-        </w:rPr>
-        <w:t xml:space="preserve"> de la planificación y gestión de requerimientos;</w:t>
-      </w:r>
-    </w:p>
-    <w:p>
-      <w:pPr>
-        <w:ind w:left="708"/>
-        <w:rPr>
-          <w:rFonts w:eastAsia="Times New Roman"/>
-        </w:rPr>
-      </w:pPr>
-      <w:r>
-        <w:rPr>
-          <w:rFonts w:eastAsia="Times New Roman"/>
-        </w:rPr>
-        <w:t xml:space="preserve">• </w:t>
-      </w:r>
-      <w:proofErr w:type="gramStart"/>
-      <w:r>
-        <w:rPr>
-          <w:rFonts w:eastAsia="Times New Roman"/>
-        </w:rPr>
-        <w:t>transferencia</w:t>
-      </w:r>
-      <w:proofErr w:type="gramEnd"/>
-      <w:r>
-        <w:rPr>
-          <w:rFonts w:eastAsia="Times New Roman"/>
-        </w:rPr>
-        <w:t xml:space="preserve"> y preservación del conocimiento institucional;</w:t>
-      </w:r>
-    </w:p>
-    <w:p>
-      <w:pPr>
-        <w:ind w:left="708"/>
-        <w:rPr>
-          <w:rFonts w:eastAsia="Times New Roman"/>
-        </w:rPr>
-      </w:pPr>
-      <w:r>
-        <w:rPr>
-          <w:rFonts w:eastAsia="Times New Roman"/>
-        </w:rPr>
-        <w:t xml:space="preserve">• </w:t>
-      </w:r>
-      <w:proofErr w:type="gramStart"/>
-      <w:r>
-        <w:rPr>
-          <w:rFonts w:eastAsia="Times New Roman"/>
-        </w:rPr>
-        <w:t>incorporación</w:t>
-      </w:r>
-      <w:proofErr w:type="gramEnd"/>
-      <w:r>
-        <w:rPr>
-          <w:rFonts w:eastAsia="Times New Roman"/>
-        </w:rPr>
-        <w:t xml:space="preserve"> progresiva de estándares técnicos y criterios comunes de desarrollo;</w:t>
-      </w:r>
-    </w:p>
-    <w:p>
-      <w:pPr>
-        <w:ind w:left="708"/>
-        <w:rPr>
-          <w:rFonts w:eastAsia="Times New Roman"/>
-        </w:rPr>
-      </w:pPr>
-      <w:r>
-        <w:rPr>
-          <w:rFonts w:eastAsia="Times New Roman"/>
-        </w:rPr>
-        <w:t xml:space="preserve">• </w:t>
-      </w:r>
-      <w:proofErr w:type="gramStart"/>
-      <w:r>
-        <w:rPr>
-          <w:rFonts w:eastAsia="Times New Roman"/>
-        </w:rPr>
-        <w:t>fortalecimiento</w:t>
-      </w:r>
-      <w:proofErr w:type="gramEnd"/>
-      <w:r>
-        <w:rPr>
-          <w:rFonts w:eastAsia="Times New Roman"/>
-        </w:rPr>
-        <w:t xml:space="preserve"> de la coordinación entre equipos;</w:t>
-      </w:r>
-    </w:p>
-    <w:p>
-      <w:pPr>
-        <w:ind w:left="708"/>
-        <w:rPr>
-          <w:rFonts w:eastAsia="Times New Roman"/>
-        </w:rPr>
-      </w:pPr>
-      <w:r>
-        <w:rPr>
-          <w:rFonts w:eastAsia="Times New Roman"/>
-        </w:rPr>
-        <w:t xml:space="preserve">• </w:t>
-      </w:r>
-      <w:proofErr w:type="gramStart"/>
-      <w:r>
-        <w:rPr>
-          <w:rFonts w:eastAsia="Times New Roman"/>
-        </w:rPr>
-        <w:t>formalización</w:t>
-      </w:r>
-      <w:proofErr w:type="gramEnd"/>
-      <w:r>
-        <w:rPr>
-          <w:rFonts w:eastAsia="Times New Roman"/>
-        </w:rPr>
-        <w:t xml:space="preserve"> del seguimiento técnico de proveedores externos;</w:t>
-      </w:r>
-    </w:p>
-    <w:p>
-      <w:pPr>
-        <w:ind w:left="708"/>
-        <w:rPr>
-          <w:rFonts w:eastAsia="Times New Roman"/>
-        </w:rPr>
-      </w:pPr>
-      <w:r>
-        <w:rPr>
-          <w:rFonts w:eastAsia="Times New Roman"/>
-        </w:rPr>
-        <w:t xml:space="preserve">• </w:t>
-      </w:r>
-      <w:proofErr w:type="gramStart"/>
-      <w:r>
-        <w:rPr>
-          <w:rFonts w:eastAsia="Times New Roman"/>
-        </w:rPr>
-        <w:t>incorporación</w:t>
-      </w:r>
-      <w:proofErr w:type="gramEnd"/>
-      <w:r>
-        <w:rPr>
-          <w:rFonts w:eastAsia="Times New Roman"/>
-        </w:rPr>
-        <w:t xml:space="preserve"> gradual de nuevas herramientas y tecnologías;</w:t>
-      </w:r>
-    </w:p>
-    <w:p>
-      <w:pPr>
-        <w:ind w:left="708"/>
-        <w:rPr>
-          <w:rFonts w:eastAsia="Times New Roman"/>
-        </w:rPr>
-      </w:pPr>
-      <w:r>
-        <w:rPr>
-          <w:rFonts w:eastAsia="Times New Roman"/>
-        </w:rPr>
-        <w:t xml:space="preserve">• </w:t>
-      </w:r>
-      <w:proofErr w:type="gramStart"/>
-      <w:r>
-        <w:rPr>
-          <w:rFonts w:eastAsia="Times New Roman"/>
-        </w:rPr>
-        <w:t>preparación</w:t>
-      </w:r>
-      <w:proofErr w:type="gramEnd"/>
-      <w:r>
-        <w:rPr>
-          <w:rFonts w:eastAsia="Times New Roman"/>
-        </w:rPr>
-        <w:t xml:space="preserve"> de futuras iniciativas de inversión cuando existan recursos presupuestarios disponibles.</w:t>
-      </w:r>
-    </w:p>
-    <w:p>
-      <w:r>
-        <w:rPr>
-          <w:rFonts w:eastAsia="Times New Roman"/>
-        </w:rPr>
-        <w:t>La incorporación de cada medida será acompañada por la evaluación de sus resultados y por los ajustes que sean necesarios para adecuarla a la realidad operativa del Departamento.</w:t>
-      </w:r>
-    </w:p>
-    <w:p/>
-    <w:p>
-      <w:pPr>
-        <w:pStyle w:val="Ttulo2"/>
-        <w:rPr>
-          <w:b/>
-        </w:rPr>
-      </w:pPr>
-      <w:r>
-        <w:rPr>
-          <w:b/>
-        </w:rPr>
         <w:t>7.3 Gestión, seguimiento y ajuste</w:t>
       </w:r>
     </w:p>
@@ -6417,7 +6733,61 @@
         <w:rPr>
           <w:rFonts w:eastAsia="Times New Roman"/>
         </w:rPr>
-        <w:t xml:space="preserve">La implementación contará con un seguimiento permanente para verificar resultados, identificar dificultades y ajustar las acciones previstas. Redefiniré prioridades, redistribuiré recursos o modificaré el orden de ejecución cuando la </w:t>
+        <w:t xml:space="preserve">La implementación contará con un seguimiento permanente para verificar resultados, identificar dificultades y ajustar las acciones previstas. </w:t>
+      </w:r>
+      <w:r>
+        <w:rPr>
+          <w:rFonts w:eastAsia="Times New Roman"/>
+        </w:rPr>
+        <w:t>Se r</w:t>
+      </w:r>
+      <w:r>
+        <w:rPr>
+          <w:rFonts w:eastAsia="Times New Roman"/>
+        </w:rPr>
+        <w:t>edefinir</w:t>
+      </w:r>
+      <w:r>
+        <w:rPr>
+          <w:rFonts w:eastAsia="Times New Roman"/>
+        </w:rPr>
+        <w:t>án</w:t>
+      </w:r>
+      <w:r>
+        <w:rPr>
+          <w:rFonts w:eastAsia="Times New Roman"/>
+        </w:rPr>
+        <w:t xml:space="preserve"> prioridades, redistribuirán</w:t>
+      </w:r>
+      <w:r>
+        <w:rPr>
+          <w:rFonts w:eastAsia="Times New Roman"/>
+        </w:rPr>
+        <w:t xml:space="preserve"> recursos o </w:t>
+      </w:r>
+      <w:r>
+        <w:rPr>
+          <w:rFonts w:eastAsia="Times New Roman"/>
+        </w:rPr>
+        <w:t xml:space="preserve">se </w:t>
+      </w:r>
+      <w:r>
+        <w:rPr>
+          <w:rFonts w:eastAsia="Times New Roman"/>
+        </w:rPr>
+        <w:t>modificar</w:t>
+      </w:r>
+      <w:r>
+        <w:rPr>
+          <w:rFonts w:eastAsia="Times New Roman"/>
+        </w:rPr>
+        <w:t>á</w:t>
+      </w:r>
+      <w:r>
+        <w:rPr>
+          <w:rFonts w:eastAsia="Times New Roman"/>
+        </w:rPr>
+        <w:t xml:space="preserve"> el orden de ejecución cuando la </w:t>
       </w:r>
       <w:r>
         <w:rPr>
@@ -6436,7 +6806,6 @@
         <w:rPr>
           <w:rFonts w:eastAsia="Times New Roman"/>
         </w:rPr>
-        <w:lastRenderedPageBreak/>
         <w:t>Los cambios normativos, incidencias críticas, evolución de proyectos o variaciones en la capacidad disponible se considerarán al revisar la planificación. Este seguimiento se realizará mediante los indicadores definidos en el capítulo siguiente, estableciendo un ciclo de diagnóstico, implementación, evaluación y ajuste para la mejora continua.</w:t>
       </w:r>
     </w:p>
@@ -6476,7 +6845,43 @@
           <w:sz w:val="22"/>
           <w:szCs w:val="22"/>
         </w:rPr>
-        <w:t>La implementación del presente Plan de Trabajo requerirá un seguimiento permanente que permita verificar el cumplimiento de objetivos, medir el impacto de las acciones y ajustar las decisiones de conducción sobre evidencia objetiva.</w:t>
+        <w:t xml:space="preserve">La implementación del presente </w:t>
+      </w:r>
+      <w:r>
+        <w:rPr>
+          <w:rFonts w:eastAsia="Times New Roman"/>
+          <w:color w:val="auto"/>
+          <w:sz w:val="22"/>
+          <w:szCs w:val="22"/>
+        </w:rPr>
+        <w:t>p</w:t>
+      </w:r>
+      <w:r>
+        <w:rPr>
+          <w:rFonts w:eastAsia="Times New Roman"/>
+          <w:color w:val="auto"/>
+          <w:sz w:val="22"/>
+          <w:szCs w:val="22"/>
+        </w:rPr>
+        <w:t xml:space="preserve">lan de </w:t>
+      </w:r>
+      <w:r>
+        <w:rPr>
+          <w:rFonts w:eastAsia="Times New Roman"/>
+          <w:color w:val="auto"/>
+          <w:sz w:val="22"/>
+          <w:szCs w:val="22"/>
+        </w:rPr>
+        <w:t>t</w:t>
+      </w:r>
+      <w:r>
+        <w:rPr>
+          <w:rFonts w:eastAsia="Times New Roman"/>
+          <w:color w:val="auto"/>
+          <w:sz w:val="22"/>
+          <w:szCs w:val="22"/>
+        </w:rPr>
+        <w:t>rabajo requerirá un seguimiento permanente que permita verificar el cumplimiento de objetivos, medir el impacto de las acciones y ajustar las decisiones de conducción sobre evidencia objetiva.</w:t>
       </w:r>
     </w:p>
     <w:p>
@@ -6534,7 +6939,19 @@
         <w:rPr>
           <w:rFonts w:eastAsia="Times New Roman"/>
         </w:rPr>
-        <w:t>Realizaré</w:t>
+        <w:t>Se r</w:t>
+      </w:r>
+      <w:r>
+        <w:rPr>
+          <w:rFonts w:eastAsia="Times New Roman"/>
+        </w:rPr>
+        <w:t>ealizar</w:t>
+      </w:r>
+      <w:r>
+        <w:rPr>
+          <w:rFonts w:eastAsia="Times New Roman"/>
+        </w:rPr>
+        <w:t>á</w:t>
       </w:r>
       <w:r>
         <w:rPr>
@@ -6731,6 +7148,7 @@
         <w:rPr>
           <w:rFonts w:eastAsia="Times New Roman"/>
         </w:rPr>
+        <w:lastRenderedPageBreak/>
         <w:t>• Monitoreo del clima laboral: charlas periódicas con el personal para evaluar las condiciones de trabajo, abordar la resistencia al cambio de manera constructiva y resolver tensiones operativas antes de que afecten el desempeño del equipo.</w:t>
       </w:r>
     </w:p>
@@ -6755,7 +7173,6 @@
         <w:rPr>
           <w:b/>
         </w:rPr>
-        <w:lastRenderedPageBreak/>
         <w:t>8. 3 3 Ajuste dinámico de la gestión y mejora continua</w:t>
       </w:r>
     </w:p>
@@ -6808,7 +7225,25 @@
         <w:rPr>
           <w:rFonts w:eastAsia="Times New Roman"/>
         </w:rPr>
-        <w:t>revisaré los</w:t>
+        <w:t>se r</w:t>
+      </w:r>
+      <w:r>
+        <w:rPr>
+          <w:rFonts w:eastAsia="Times New Roman"/>
+        </w:rPr>
+        <w:t>evisar</w:t>
+      </w:r>
+      <w:r>
+        <w:rPr>
+          <w:rFonts w:eastAsia="Times New Roman"/>
+        </w:rPr>
+        <w:t>án</w:t>
+      </w:r>
+      <w:r>
+        <w:rPr>
+          <w:rFonts w:eastAsia="Times New Roman"/>
+        </w:rPr>
+        <w:t xml:space="preserve"> los</w:t>
       </w:r>
       <w:r>
         <w:rPr>
@@ -6833,104 +7268,122 @@
           <w:rFonts w:eastAsia="Times New Roman"/>
         </w:rPr>
         <w:t xml:space="preserve">esponsabilidades o reforzar </w:t>
+      </w:r>
+      <w:r>
+        <w:rPr>
+          <w:rFonts w:eastAsia="Times New Roman"/>
+        </w:rPr>
+        <w:t>la capacitación interna, manteniendo la planificación como una herramienta viva de gestión.</w:t>
+      </w:r>
+    </w:p>
+    <w:p/>
+    <w:p>
+      <w:pPr>
+        <w:pStyle w:val="Ttulo1"/>
+        <w:rPr>
+          <w:b/>
+          <w:sz w:val="28"/>
+          <w:szCs w:val="28"/>
+        </w:rPr>
+      </w:pPr>
+      <w:r>
+        <w:rPr>
+          <w:b/>
+          <w:sz w:val="28"/>
+          <w:szCs w:val="28"/>
+        </w:rPr>
+        <w:t>9. CONCLUSIONES</w:t>
+      </w:r>
+    </w:p>
+    <w:p>
+      <w:pPr>
+        <w:pStyle w:val="Ttulo1"/>
+        <w:rPr>
+          <w:rFonts w:eastAsia="Times New Roman"/>
+          <w:color w:val="auto"/>
+          <w:sz w:val="22"/>
+          <w:szCs w:val="22"/>
+        </w:rPr>
+      </w:pPr>
+      <w:r>
+        <w:rPr>
+          <w:rFonts w:eastAsia="Times New Roman"/>
+          <w:color w:val="auto"/>
+          <w:sz w:val="22"/>
+          <w:szCs w:val="22"/>
+        </w:rPr>
+        <w:t xml:space="preserve">El Departamento de Gestión, Desarrollo e Innovación en Sistemas de Software cumple un rol estratégico dentro de la transformación digital de la Municipalidad de General </w:t>
+      </w:r>
+      <w:proofErr w:type="spellStart"/>
+      <w:r>
+        <w:rPr>
+          <w:rFonts w:eastAsia="Times New Roman"/>
+          <w:color w:val="auto"/>
+          <w:sz w:val="22"/>
+          <w:szCs w:val="22"/>
+        </w:rPr>
+        <w:t>Pueyrredon</w:t>
+      </w:r>
+      <w:proofErr w:type="spellEnd"/>
+      <w:r>
+        <w:rPr>
+          <w:rFonts w:eastAsia="Times New Roman"/>
+          <w:color w:val="auto"/>
+          <w:sz w:val="22"/>
+          <w:szCs w:val="22"/>
+        </w:rPr>
+        <w:t>. La creciente demanda de soluciones informáticas hace necesario fortalecer su capacidad de planificación, coordinación y organización, asegurando que el conocimiento institucional, la calidad del software y la continuidad operativa no dependan exclusivamente de iniciativas individuales.</w:t>
+      </w:r>
+    </w:p>
+    <w:p>
+      <w:pPr>
+        <w:pStyle w:val="Ttulo1"/>
+        <w:rPr>
+          <w:rFonts w:eastAsia="Times New Roman"/>
+          <w:color w:val="auto"/>
+          <w:sz w:val="22"/>
+          <w:szCs w:val="22"/>
+        </w:rPr>
+      </w:pPr>
+    </w:p>
+    <w:p>
+      <w:pPr>
+        <w:pStyle w:val="Ttulo1"/>
+        <w:rPr>
+          <w:rFonts w:eastAsia="Times New Roman"/>
+          <w:color w:val="auto"/>
+          <w:sz w:val="22"/>
+          <w:szCs w:val="22"/>
+        </w:rPr>
+      </w:pPr>
+      <w:r>
+        <w:rPr>
+          <w:rFonts w:eastAsia="Times New Roman"/>
+          <w:color w:val="auto"/>
+          <w:sz w:val="22"/>
+          <w:szCs w:val="22"/>
+        </w:rPr>
+        <w:t xml:space="preserve">Las propuestas de este </w:t>
+      </w:r>
+      <w:r>
+        <w:rPr>
+          <w:rFonts w:eastAsia="Times New Roman"/>
+          <w:color w:val="auto"/>
+          <w:sz w:val="22"/>
+          <w:szCs w:val="22"/>
+        </w:rPr>
+        <w:t>p</w:t>
       </w:r>
       <w:bookmarkStart w:id="0" w:name="_GoBack"/>
       <w:bookmarkEnd w:id="0"/>
       <w:r>
         <w:rPr>
           <w:rFonts w:eastAsia="Times New Roman"/>
-        </w:rPr>
-        <w:t>la capacitación interna, manteniendo la planificación como una herramienta viva de gestión.</w:t>
-      </w:r>
-    </w:p>
-    <w:p/>
-    <w:p>
-      <w:pPr>
-        <w:pStyle w:val="Ttulo1"/>
-        <w:rPr>
-          <w:b/>
-          <w:sz w:val="28"/>
-          <w:szCs w:val="28"/>
-        </w:rPr>
-      </w:pPr>
-      <w:r>
-        <w:rPr>
-          <w:b/>
-          <w:sz w:val="28"/>
-          <w:szCs w:val="28"/>
-        </w:rPr>
-        <w:t>9. CONCLUSIONES</w:t>
-      </w:r>
-    </w:p>
-    <w:p>
-      <w:pPr>
-        <w:pStyle w:val="Ttulo1"/>
-        <w:rPr>
-          <w:rFonts w:eastAsia="Times New Roman"/>
-          <w:color w:val="auto"/>
-          <w:sz w:val="22"/>
-          <w:szCs w:val="22"/>
-        </w:rPr>
-      </w:pPr>
-      <w:r>
-        <w:rPr>
-          <w:rFonts w:eastAsia="Times New Roman"/>
-          <w:color w:val="auto"/>
-          <w:sz w:val="22"/>
-          <w:szCs w:val="22"/>
-        </w:rPr>
-        <w:t xml:space="preserve">El Departamento de Gestión, Desarrollo e Innovación en Sistemas de Software cumple un rol estratégico dentro de la transformación digital de la Municipalidad de General </w:t>
-      </w:r>
-      <w:proofErr w:type="spellStart"/>
-      <w:r>
-        <w:rPr>
-          <w:rFonts w:eastAsia="Times New Roman"/>
-          <w:color w:val="auto"/>
-          <w:sz w:val="22"/>
-          <w:szCs w:val="22"/>
-        </w:rPr>
-        <w:t>Pueyrredon</w:t>
-      </w:r>
-      <w:proofErr w:type="spellEnd"/>
-      <w:r>
-        <w:rPr>
-          <w:rFonts w:eastAsia="Times New Roman"/>
-          <w:color w:val="auto"/>
-          <w:sz w:val="22"/>
-          <w:szCs w:val="22"/>
-        </w:rPr>
-        <w:t>. La creciente demanda de soluciones informáticas hace necesario fortalecer su capacidad de planificación, coordinación y organización, asegurando que el conocimiento institucional, la calidad del software y la continuidad operativa no dependan exclusivamente de iniciativas individuales.</w:t>
-      </w:r>
-    </w:p>
-    <w:p>
-      <w:pPr>
-        <w:pStyle w:val="Ttulo1"/>
-        <w:rPr>
-          <w:rFonts w:eastAsia="Times New Roman"/>
-          <w:color w:val="auto"/>
-          <w:sz w:val="22"/>
-          <w:szCs w:val="22"/>
-        </w:rPr>
-      </w:pPr>
-    </w:p>
-    <w:p>
-      <w:pPr>
-        <w:pStyle w:val="Ttulo1"/>
-        <w:rPr>
-          <w:rFonts w:eastAsia="Times New Roman"/>
-          <w:color w:val="auto"/>
-          <w:sz w:val="22"/>
-          <w:szCs w:val="22"/>
-        </w:rPr>
-      </w:pPr>
-      <w:r>
-        <w:rPr>
-          <w:rFonts w:eastAsia="Times New Roman"/>
-          <w:color w:val="auto"/>
-          <w:sz w:val="22"/>
-          <w:szCs w:val="22"/>
-        </w:rPr>
-        <w:t>Las propuestas de este Plan parten de un criterio de realismo y priorizan la optimización de recursos actualmente disponibles mediante la mejora de procedimientos, la gestión del conocimiento, la estandarización técnica y el fortalecimiento de la conducción. La incorporación futura de recursos tecnológicos y presupuestarios permitirá potenciar estas acciones, consolidando un proceso de modernización sostenido.</w:t>
+          <w:color w:val="auto"/>
+          <w:sz w:val="22"/>
+          <w:szCs w:val="22"/>
+        </w:rPr>
+        <w:t>lan parten de un criterio de realismo y priorizan la optimización de recursos actualmente disponibles mediante la mejora de procedimientos, la gestión del conocimiento, la estandarización técnica y el fortalecimiento de la conducción. La incorporación futura de recursos tecnológicos y presupuestarios permitirá potenciar estas acciones, consolidando un proceso de modernización sostenido.</w:t>
       </w:r>
     </w:p>
     <w:p>

</xml_diff>